<commit_message>
new file:   .codegraph/.gitignore 	modified:   A_PredictedPoints_Gen.py 	modified:   B_Depth_Prediction.py 	modified:   User_guide.docx 	modified:   build_release.bat 	modified:   dem_builder.py 	modified:   environment.yml 	modified:   main.py 	modified:   requirements.txt 	modified:   ui/dialogs/bathymetry_dialog.py 	modified:   ui/main_window.py 	modified:   ui/pages/page_bathymetry.py
</commit_message>
<xml_diff>
--- a/User_guide.docx
+++ b/User_guide.docx
@@ -29,12 +29,14 @@
           <w:rFonts w:hint="eastAsia"/>
         </w:rPr>
       </w:pPr>
+      <w:proofErr w:type="gramStart"/>
       <w:r>
         <w:rPr>
           <w:rFonts w:hint="eastAsia"/>
         </w:rPr>
         <w:t>说明:</w:t>
       </w:r>
+      <w:proofErr w:type="gramEnd"/>
       <w:r>
         <w:rPr>
           <w:rFonts w:hint="eastAsia"/>
@@ -170,6 +172,7 @@
           <w:rFonts w:hint="eastAsia"/>
         </w:rPr>
       </w:pPr>
+      <w:bookmarkStart w:id="0" w:name="OLE_LINK1"/>
       <w:r>
         <w:rPr>
           <w:rFonts w:hint="eastAsia"/>
@@ -180,7 +183,49 @@
         <w:rPr>
           <w:rFonts w:hint="eastAsia"/>
         </w:rPr>
-        <w:t>右上角的添加数据支持添加tif格式和shp格式的数据加载至中间的3维地球可视化查看，其中tif格式数据需确保为正常的高程类数据以避免加载失败。搜索栏暂时未添加交互功能。</w:t>
+        <w:t>右上角的添加数据支持添加</w:t>
+      </w:r>
+      <w:proofErr w:type="spellStart"/>
+      <w:r>
+        <w:rPr>
+          <w:rFonts w:hint="eastAsia"/>
+        </w:rPr>
+        <w:t>tif</w:t>
+      </w:r>
+      <w:proofErr w:type="spellEnd"/>
+      <w:r>
+        <w:rPr>
+          <w:rFonts w:hint="eastAsia"/>
+        </w:rPr>
+        <w:t>格式和</w:t>
+      </w:r>
+      <w:proofErr w:type="spellStart"/>
+      <w:r>
+        <w:rPr>
+          <w:rFonts w:hint="eastAsia"/>
+        </w:rPr>
+        <w:t>shp</w:t>
+      </w:r>
+      <w:proofErr w:type="spellEnd"/>
+      <w:r>
+        <w:rPr>
+          <w:rFonts w:hint="eastAsia"/>
+        </w:rPr>
+        <w:t>格式的数据加载至中间的3维地球可视化查看，其中</w:t>
+      </w:r>
+      <w:proofErr w:type="spellStart"/>
+      <w:r>
+        <w:rPr>
+          <w:rFonts w:hint="eastAsia"/>
+        </w:rPr>
+        <w:t>tif</w:t>
+      </w:r>
+      <w:proofErr w:type="spellEnd"/>
+      <w:r>
+        <w:rPr>
+          <w:rFonts w:hint="eastAsia"/>
+        </w:rPr>
+        <w:t>格式数据需确保为正常的高程类数据以避免加载失败。搜索栏暂时未添加交互功能。</w:t>
       </w:r>
       <w:r>
         <w:rPr>
@@ -195,6 +240,7 @@
         <w:t>细则</w:t>
       </w:r>
     </w:p>
+    <w:bookmarkEnd w:id="0"/>
     <w:p>
       <w:pPr>
         <w:rPr>
@@ -247,6 +293,7 @@
     <w:p>
       <w:pPr>
         <w:rPr>
+          <w:rFonts w:hint="eastAsia"/>
           <w:b/>
           <w:bCs/>
         </w:rPr>
@@ -272,6 +319,7 @@
         <w:rPr>
           <w:b/>
           <w:bCs/>
+          <w:noProof/>
         </w:rPr>
         <w:drawing>
           <wp:inline distT="0" distB="0" distL="0" distR="0" wp14:anchorId="295726E8" wp14:editId="750EE84B">
@@ -332,7 +380,21 @@
         <w:rPr>
           <w:rFonts w:hint="eastAsia"/>
         </w:rPr>
-        <w:t>范围tif会被命名为test1_extent.tif。</w:t>
+        <w:t>范围</w:t>
+      </w:r>
+      <w:proofErr w:type="spellStart"/>
+      <w:r>
+        <w:rPr>
+          <w:rFonts w:hint="eastAsia"/>
+        </w:rPr>
+        <w:t>tif</w:t>
+      </w:r>
+      <w:proofErr w:type="spellEnd"/>
+      <w:r>
+        <w:rPr>
+          <w:rFonts w:hint="eastAsia"/>
+        </w:rPr>
+        <w:t>会被命名为test1_extent.tif。</w:t>
       </w:r>
     </w:p>
     <w:p>
@@ -459,7 +521,21 @@
         <w:rPr>
           <w:rFonts w:hint="eastAsia"/>
         </w:rPr>
-        <w:t>与湖泊面shp，</w:t>
+        <w:t>与湖泊面</w:t>
+      </w:r>
+      <w:proofErr w:type="spellStart"/>
+      <w:r>
+        <w:rPr>
+          <w:rFonts w:hint="eastAsia"/>
+        </w:rPr>
+        <w:t>shp</w:t>
+      </w:r>
+      <w:proofErr w:type="spellEnd"/>
+      <w:r>
+        <w:rPr>
+          <w:rFonts w:hint="eastAsia"/>
+        </w:rPr>
+        <w:t>，</w:t>
       </w:r>
       <w:r>
         <w:rPr>
@@ -478,20 +554,30 @@
         <w:rPr>
           <w:rFonts w:hint="eastAsia"/>
         </w:rPr>
-        <w:t>二值湖泊范围tif</w:t>
-      </w:r>
+        <w:t>二值湖泊范围</w:t>
+      </w:r>
+      <w:proofErr w:type="spellStart"/>
+      <w:r>
+        <w:rPr>
+          <w:rFonts w:hint="eastAsia"/>
+        </w:rPr>
+        <w:t>tif</w:t>
+      </w:r>
+      <w:proofErr w:type="spellEnd"/>
       <w:r>
         <w:rPr>
           <w:rFonts w:hint="eastAsia"/>
         </w:rPr>
         <w:t xml:space="preserve"> </w:t>
       </w:r>
+      <w:proofErr w:type="gramStart"/>
       <w:r>
         <w:rPr>
           <w:rFonts w:hint="eastAsia"/>
         </w:rPr>
         <w:t>(</w:t>
       </w:r>
+      <w:proofErr w:type="spellStart"/>
       <w:r>
         <w:rPr>
           <w:rFonts w:hint="eastAsia"/>
@@ -502,8 +588,16 @@
         <w:rPr>
           <w:rFonts w:hint="eastAsia"/>
         </w:rPr>
-        <w:t>_extent.tif)</w:t>
-      </w:r>
+        <w:t>_extent.tif</w:t>
+      </w:r>
+      <w:proofErr w:type="spellEnd"/>
+      <w:r>
+        <w:rPr>
+          <w:rFonts w:hint="eastAsia"/>
+        </w:rPr>
+        <w:t>)</w:t>
+      </w:r>
+      <w:proofErr w:type="gramEnd"/>
     </w:p>
     <w:p>
       <w:pPr>
@@ -533,7 +627,21 @@
         <w:rPr>
           <w:rFonts w:hint="eastAsia"/>
         </w:rPr>
-        <w:t>(name_extent.tif)</w:t>
+        <w:t>(</w:t>
+      </w:r>
+      <w:proofErr w:type="spellStart"/>
+      <w:r>
+        <w:rPr>
+          <w:rFonts w:hint="eastAsia"/>
+        </w:rPr>
+        <w:t>name_extent.tif</w:t>
+      </w:r>
+      <w:proofErr w:type="spellEnd"/>
+      <w:r>
+        <w:rPr>
+          <w:rFonts w:hint="eastAsia"/>
+        </w:rPr>
+        <w:t>)</w:t>
       </w:r>
       <w:r>
         <w:t>.</w:t>
@@ -549,6 +657,7 @@
     <w:p>
       <w:pPr>
         <w:rPr>
+          <w:rFonts w:hint="eastAsia"/>
           <w:b/>
           <w:bCs/>
         </w:rPr>
@@ -569,6 +678,9 @@
         </w:rPr>
       </w:pPr>
       <w:r>
+        <w:rPr>
+          <w:noProof/>
+        </w:rPr>
         <w:drawing>
           <wp:inline distT="0" distB="0" distL="0" distR="0" wp14:anchorId="3BA201A2" wp14:editId="5D19D0A8">
             <wp:extent cx="3337841" cy="2115386"/>
@@ -616,20 +728,58 @@
         <w:rPr>
           <w:rFonts w:hint="eastAsia"/>
         </w:rPr>
-        <w:t>该功能从读取的湖泊面shp提取得到湖泊边缘线shp</w:t>
-      </w:r>
+        <w:t>该功能从读取的湖泊面</w:t>
+      </w:r>
+      <w:proofErr w:type="spellStart"/>
+      <w:r>
+        <w:rPr>
+          <w:rFonts w:hint="eastAsia"/>
+        </w:rPr>
+        <w:t>shp</w:t>
+      </w:r>
+      <w:proofErr w:type="spellEnd"/>
+      <w:r>
+        <w:rPr>
+          <w:rFonts w:hint="eastAsia"/>
+        </w:rPr>
+        <w:t>提取得到湖泊边缘线</w:t>
+      </w:r>
+      <w:proofErr w:type="spellStart"/>
+      <w:r>
+        <w:rPr>
+          <w:rFonts w:hint="eastAsia"/>
+        </w:rPr>
+        <w:t>shp</w:t>
+      </w:r>
+      <w:proofErr w:type="spellEnd"/>
       <w:r>
         <w:rPr>
           <w:rFonts w:hint="eastAsia"/>
         </w:rPr>
         <w:t xml:space="preserve"> </w:t>
       </w:r>
-      <w:r>
-        <w:rPr>
-          <w:rFonts w:hint="eastAsia"/>
-        </w:rPr>
-        <w:t>(shoreline.shp)</w:t>
-      </w:r>
+      <w:proofErr w:type="gramStart"/>
+      <w:r>
+        <w:rPr>
+          <w:rFonts w:hint="eastAsia"/>
+        </w:rPr>
+        <w:t>(</w:t>
+      </w:r>
+      <w:proofErr w:type="spellStart"/>
+      <w:r>
+        <w:rPr>
+          <w:rFonts w:hint="eastAsia"/>
+        </w:rPr>
+        <w:t>shoreline.shp</w:t>
+      </w:r>
+      <w:proofErr w:type="spellEnd"/>
+      <w:r>
+        <w:rPr>
+          <w:rFonts w:hint="eastAsia"/>
+        </w:rPr>
+        <w:t>)</w:t>
+      </w:r>
+      <w:proofErr w:type="gramEnd"/>
     </w:p>
     <w:p>
       <w:pPr>
@@ -722,7 +872,21 @@
         <w:rPr>
           <w:rFonts w:hint="eastAsia"/>
         </w:rPr>
-        <w:t>该功能输入为湖泊面shp和原始地表</w:t>
+        <w:t>该功能输入为湖泊面</w:t>
+      </w:r>
+      <w:proofErr w:type="spellStart"/>
+      <w:r>
+        <w:rPr>
+          <w:rFonts w:hint="eastAsia"/>
+        </w:rPr>
+        <w:t>shp</w:t>
+      </w:r>
+      <w:proofErr w:type="spellEnd"/>
+      <w:r>
+        <w:rPr>
+          <w:rFonts w:hint="eastAsia"/>
+        </w:rPr>
+        <w:t>和原始地表</w:t>
       </w:r>
       <w:r>
         <w:rPr>
@@ -734,44 +898,128 @@
         <w:rPr>
           <w:rFonts w:hint="eastAsia"/>
         </w:rPr>
-        <w:t>数据，设置缓冲区宽度后输出：1.包含缓冲区的湖泊面shp</w:t>
-      </w:r>
+        <w:t>数据，设置缓冲区宽度后输出：1.包含缓冲区的湖泊面</w:t>
+      </w:r>
+      <w:proofErr w:type="spellStart"/>
+      <w:r>
+        <w:rPr>
+          <w:rFonts w:hint="eastAsia"/>
+        </w:rPr>
+        <w:t>shp</w:t>
+      </w:r>
+      <w:proofErr w:type="spellEnd"/>
       <w:r>
         <w:rPr>
           <w:rFonts w:hint="eastAsia"/>
         </w:rPr>
         <w:t xml:space="preserve"> </w:t>
       </w:r>
-      <w:r>
-        <w:rPr>
-          <w:rFonts w:hint="eastAsia"/>
-        </w:rPr>
-        <w:t>(name_buffer.shp) 2.包含缓冲区的湖泊及周边地形tif</w:t>
-      </w:r>
+      <w:proofErr w:type="gramStart"/>
+      <w:r>
+        <w:rPr>
+          <w:rFonts w:hint="eastAsia"/>
+        </w:rPr>
+        <w:t>(</w:t>
+      </w:r>
+      <w:proofErr w:type="spellStart"/>
+      <w:r>
+        <w:rPr>
+          <w:rFonts w:hint="eastAsia"/>
+        </w:rPr>
+        <w:t>name_buffer.shp</w:t>
+      </w:r>
+      <w:proofErr w:type="spellEnd"/>
+      <w:r>
+        <w:rPr>
+          <w:rFonts w:hint="eastAsia"/>
+        </w:rPr>
+        <w:t>)</w:t>
+      </w:r>
+      <w:proofErr w:type="gramEnd"/>
+      <w:r>
+        <w:rPr>
+          <w:rFonts w:hint="eastAsia"/>
+        </w:rPr>
+        <w:t xml:space="preserve"> 2.包含缓冲区的湖泊及周边地形</w:t>
+      </w:r>
+      <w:proofErr w:type="spellStart"/>
+      <w:r>
+        <w:rPr>
+          <w:rFonts w:hint="eastAsia"/>
+        </w:rPr>
+        <w:t>tif</w:t>
+      </w:r>
+      <w:proofErr w:type="spellEnd"/>
       <w:r>
         <w:rPr>
           <w:rFonts w:hint="eastAsia"/>
         </w:rPr>
         <w:t xml:space="preserve"> </w:t>
       </w:r>
-      <w:r>
-        <w:rPr>
-          <w:rFonts w:hint="eastAsia"/>
-        </w:rPr>
-        <w:t>(name_merit.tif) 3.包含缓冲区的湖泊及周边坡度tif</w:t>
-      </w:r>
+      <w:proofErr w:type="gramStart"/>
+      <w:r>
+        <w:rPr>
+          <w:rFonts w:hint="eastAsia"/>
+        </w:rPr>
+        <w:t>(</w:t>
+      </w:r>
+      <w:proofErr w:type="spellStart"/>
+      <w:r>
+        <w:rPr>
+          <w:rFonts w:hint="eastAsia"/>
+        </w:rPr>
+        <w:t>name_merit.tif</w:t>
+      </w:r>
+      <w:proofErr w:type="spellEnd"/>
+      <w:r>
+        <w:rPr>
+          <w:rFonts w:hint="eastAsia"/>
+        </w:rPr>
+        <w:t>)</w:t>
+      </w:r>
+      <w:proofErr w:type="gramEnd"/>
+      <w:r>
+        <w:rPr>
+          <w:rFonts w:hint="eastAsia"/>
+        </w:rPr>
+        <w:t xml:space="preserve"> 3.包含缓冲区的湖泊及周边坡度</w:t>
+      </w:r>
+      <w:proofErr w:type="spellStart"/>
+      <w:r>
+        <w:rPr>
+          <w:rFonts w:hint="eastAsia"/>
+        </w:rPr>
+        <w:t>tif</w:t>
+      </w:r>
+      <w:proofErr w:type="spellEnd"/>
       <w:r>
         <w:rPr>
           <w:rFonts w:hint="eastAsia"/>
         </w:rPr>
         <w:t xml:space="preserve"> </w:t>
       </w:r>
-      <w:r>
-        <w:rPr>
-          <w:rFonts w:hint="eastAsia"/>
-        </w:rPr>
-        <w:t>(name_slope.tif)</w:t>
-      </w:r>
+      <w:proofErr w:type="gramStart"/>
+      <w:r>
+        <w:rPr>
+          <w:rFonts w:hint="eastAsia"/>
+        </w:rPr>
+        <w:t>(</w:t>
+      </w:r>
+      <w:proofErr w:type="spellStart"/>
+      <w:r>
+        <w:rPr>
+          <w:rFonts w:hint="eastAsia"/>
+        </w:rPr>
+        <w:t>name_slope.tif</w:t>
+      </w:r>
+      <w:proofErr w:type="spellEnd"/>
+      <w:r>
+        <w:rPr>
+          <w:rFonts w:hint="eastAsia"/>
+        </w:rPr>
+        <w:t>)</w:t>
+      </w:r>
+      <w:proofErr w:type="gramEnd"/>
     </w:p>
     <w:p>
       <w:pPr>
@@ -795,13 +1043,40 @@
         <w:t>DEM</w:t>
       </w:r>
       <w:r>
-        <w:t xml:space="preserve"> data as input. After setting the buffer width, it outputs: 1. A lake polygon SHP with the buffer (name_buffer.shp); 2. A TIF file of the lake and surrounding terrain within the buffer (name_merit.tif); 3. A TIF file of the lake and surrounding slope within the buffer (name_slope.tif).</w:t>
+        <w:t xml:space="preserve"> data as input. After setting the buffer width, it outputs: 1. A lake polygon SHP with the buffer (</w:t>
+      </w:r>
+      <w:proofErr w:type="spellStart"/>
+      <w:r>
+        <w:t>name_buffer.shp</w:t>
+      </w:r>
+      <w:proofErr w:type="spellEnd"/>
+      <w:r>
+        <w:t>); 2. A TIF file of the lake and surrounding terrain within the buffer (</w:t>
+      </w:r>
+      <w:proofErr w:type="spellStart"/>
+      <w:r>
+        <w:t>name_merit.tif</w:t>
+      </w:r>
+      <w:proofErr w:type="spellEnd"/>
+      <w:r>
+        <w:t>); 3. A TIF file of the lake and surrounding slope within the buffer (</w:t>
+      </w:r>
+      <w:proofErr w:type="spellStart"/>
+      <w:r>
+        <w:t>name_slope.tif</w:t>
+      </w:r>
+      <w:proofErr w:type="spellEnd"/>
+      <w:r>
+        <w:t>).</w:t>
       </w:r>
     </w:p>
     <w:p>
       <w:pPr>
         <w:widowControl/>
         <w:jc w:val="left"/>
+        <w:rPr>
+          <w:rFonts w:hint="eastAsia"/>
+        </w:rPr>
       </w:pPr>
     </w:p>
     <w:p>
@@ -823,8 +1098,14 @@
       <w:pPr>
         <w:widowControl/>
         <w:jc w:val="left"/>
-      </w:pPr>
-      <w:r>
+        <w:rPr>
+          <w:rFonts w:hint="eastAsia"/>
+        </w:rPr>
+      </w:pPr>
+      <w:r>
+        <w:rPr>
+          <w:noProof/>
+        </w:rPr>
         <w:lastRenderedPageBreak/>
         <w:drawing>
           <wp:inline distT="0" distB="0" distL="0" distR="0" wp14:anchorId="1BBC9B83" wp14:editId="2969092F">
@@ -1005,8 +1286,16 @@
         <w:rPr>
           <w:rFonts w:hint="eastAsia"/>
         </w:rPr>
-        <w:t>中生成的merit.tif</w:t>
-      </w:r>
+        <w:t>中生成的</w:t>
+      </w:r>
+      <w:proofErr w:type="spellStart"/>
+      <w:r>
+        <w:rPr>
+          <w:rFonts w:hint="eastAsia"/>
+        </w:rPr>
+        <w:t>merit.tif</w:t>
+      </w:r>
+      <w:proofErr w:type="spellEnd"/>
       <w:r>
         <w:rPr>
           <w:rFonts w:hint="eastAsia"/>
@@ -1017,7 +1306,21 @@
         <w:rPr>
           <w:rFonts w:hint="eastAsia"/>
         </w:rPr>
-        <w:t>以及需要事先准备的实测测深点shp，在设置预测点相关参数后会计算</w:t>
+        <w:t>以及需要事先准备的实测测深点</w:t>
+      </w:r>
+      <w:proofErr w:type="spellStart"/>
+      <w:r>
+        <w:rPr>
+          <w:rFonts w:hint="eastAsia"/>
+        </w:rPr>
+        <w:t>shp</w:t>
+      </w:r>
+      <w:proofErr w:type="spellEnd"/>
+      <w:r>
+        <w:rPr>
+          <w:rFonts w:hint="eastAsia"/>
+        </w:rPr>
+        <w:t>，在设置预测点相关参数后会计算</w:t>
       </w:r>
       <w:r>
         <w:rPr>
@@ -1051,11 +1354,39 @@
         <w:t>DEM</w:t>
       </w:r>
       <w:r>
-        <w:t xml:space="preserve"> (if not specified, the merit.tif generated in the buffer full process will be selected by default), and a pre-prepared measured bathymetric point SHP file. After setting the relevant parameters for the prediction points, it will calculate and generate: 1. A TXT file in MLData for subsequent training, and 2. Shoreline and measured point files in TIF format.</w:t>
-      </w:r>
-    </w:p>
-    <w:p/>
-    <w:p/>
+        <w:t xml:space="preserve"> (if not specified, the </w:t>
+      </w:r>
+      <w:proofErr w:type="spellStart"/>
+      <w:r>
+        <w:t>merit.tif</w:t>
+      </w:r>
+      <w:proofErr w:type="spellEnd"/>
+      <w:r>
+        <w:t xml:space="preserve"> generated in the buffer full process will be selected by default), and a pre-prepared measured bathymetric point SHP file. After setting the relevant parameters for the prediction points, it will calculate and generate: 1. A TXT file in </w:t>
+      </w:r>
+      <w:proofErr w:type="spellStart"/>
+      <w:r>
+        <w:t>MLData</w:t>
+      </w:r>
+      <w:proofErr w:type="spellEnd"/>
+      <w:r>
+        <w:t xml:space="preserve"> for subsequent training, and 2. Shoreline and measured point files in TIF format.</w:t>
+      </w:r>
+    </w:p>
+    <w:p>
+      <w:pPr>
+        <w:rPr>
+          <w:rFonts w:hint="eastAsia"/>
+        </w:rPr>
+      </w:pPr>
+    </w:p>
+    <w:p>
+      <w:pPr>
+        <w:rPr>
+          <w:rFonts w:hint="eastAsia"/>
+        </w:rPr>
+      </w:pPr>
+    </w:p>
     <w:p>
       <w:pPr>
         <w:rPr>
@@ -1138,8 +1469,44 @@
         <w:rPr>
           <w:rFonts w:hint="eastAsia"/>
         </w:rPr>
-        <w:t>该功能为机器学习生成预测点水深的主要模块，通过设置工作空间路径，自动读取MLData中前置文件与其余相关文件，设置全湖平均分布的预测点相关参数，在多轮优化后得到最优结果，输出temp_ML中的预测点shp</w:t>
-      </w:r>
+        <w:t>该功能为机器学习生成预测点水深的主要模块，通过设置工作空间路径，自动读取</w:t>
+      </w:r>
+      <w:proofErr w:type="spellStart"/>
+      <w:r>
+        <w:rPr>
+          <w:rFonts w:hint="eastAsia"/>
+        </w:rPr>
+        <w:t>MLData</w:t>
+      </w:r>
+      <w:proofErr w:type="spellEnd"/>
+      <w:r>
+        <w:rPr>
+          <w:rFonts w:hint="eastAsia"/>
+        </w:rPr>
+        <w:t>中前置文件与其余相关文件，设置全湖平均分布的预测点相关参数，在多轮优化后得到最优结果，输出</w:t>
+      </w:r>
+      <w:proofErr w:type="spellStart"/>
+      <w:r>
+        <w:rPr>
+          <w:rFonts w:hint="eastAsia"/>
+        </w:rPr>
+        <w:t>temp_ML</w:t>
+      </w:r>
+      <w:proofErr w:type="spellEnd"/>
+      <w:r>
+        <w:rPr>
+          <w:rFonts w:hint="eastAsia"/>
+        </w:rPr>
+        <w:t>中的预测点</w:t>
+      </w:r>
+      <w:proofErr w:type="spellStart"/>
+      <w:r>
+        <w:rPr>
+          <w:rFonts w:hint="eastAsia"/>
+        </w:rPr>
+        <w:t>shp</w:t>
+      </w:r>
+      <w:proofErr w:type="spellEnd"/>
     </w:p>
     <w:p>
       <w:pPr>
@@ -1162,7 +1529,23 @@
         </w:rPr>
       </w:pPr>
       <w:r>
-        <w:t>This function serves as the main module for machine learning to generate predicted water depth points. By setting the workspace path, it automatically reads the pre-processing files and other related files in MLData, configures parameters for lake-wide uniformly distributed prediction points, and obtains the optimal results after multiple rounds of optimization, outputting the predicted point SHP files in temp_ML.</w:t>
+        <w:t xml:space="preserve">This function serves as the main module for machine learning to generate predicted water depth points. By setting the workspace path, it automatically reads the pre-processing files and other related files in </w:t>
+      </w:r>
+      <w:proofErr w:type="spellStart"/>
+      <w:r>
+        <w:t>MLData</w:t>
+      </w:r>
+      <w:proofErr w:type="spellEnd"/>
+      <w:r>
+        <w:t xml:space="preserve">, configures parameters for lake-wide uniformly distributed prediction points, and obtains the optimal results after multiple rounds of optimization, outputting the predicted point SHP files in </w:t>
+      </w:r>
+      <w:proofErr w:type="spellStart"/>
+      <w:r>
+        <w:t>temp_ML</w:t>
+      </w:r>
+      <w:proofErr w:type="spellEnd"/>
+      <w:r>
+        <w:t>.</w:t>
       </w:r>
     </w:p>
     <w:p>
@@ -1260,13 +1643,63 @@
         <w:rPr>
           <w:rFonts w:hint="eastAsia"/>
         </w:rPr>
-        <w:t>该功能通过利用生成的预测点shp、湖岸线shp、湖泊面shp</w:t>
-      </w:r>
-      <w:r>
-        <w:rPr>
-          <w:rFonts w:hint="eastAsia"/>
-        </w:rPr>
-        <w:t>，通过自定义的分辨率实现从点到面的水深预测，输出得到水深分布的tif文件</w:t>
+        <w:t>该功能通过利用生成的预测点</w:t>
+      </w:r>
+      <w:proofErr w:type="spellStart"/>
+      <w:r>
+        <w:rPr>
+          <w:rFonts w:hint="eastAsia"/>
+        </w:rPr>
+        <w:t>shp</w:t>
+      </w:r>
+      <w:proofErr w:type="spellEnd"/>
+      <w:r>
+        <w:rPr>
+          <w:rFonts w:hint="eastAsia"/>
+        </w:rPr>
+        <w:t>、湖岸线</w:t>
+      </w:r>
+      <w:proofErr w:type="spellStart"/>
+      <w:r>
+        <w:rPr>
+          <w:rFonts w:hint="eastAsia"/>
+        </w:rPr>
+        <w:t>shp</w:t>
+      </w:r>
+      <w:proofErr w:type="spellEnd"/>
+      <w:r>
+        <w:rPr>
+          <w:rFonts w:hint="eastAsia"/>
+        </w:rPr>
+        <w:t>、湖泊面</w:t>
+      </w:r>
+      <w:proofErr w:type="spellStart"/>
+      <w:r>
+        <w:rPr>
+          <w:rFonts w:hint="eastAsia"/>
+        </w:rPr>
+        <w:t>shp</w:t>
+      </w:r>
+      <w:proofErr w:type="spellEnd"/>
+      <w:r>
+        <w:rPr>
+          <w:rFonts w:hint="eastAsia"/>
+        </w:rPr>
+        <w:t>，通过自定义的分辨率实现从点到面的水深预测，输出得到水深分布的</w:t>
+      </w:r>
+      <w:proofErr w:type="spellStart"/>
+      <w:r>
+        <w:rPr>
+          <w:rFonts w:hint="eastAsia"/>
+        </w:rPr>
+        <w:t>tif</w:t>
+      </w:r>
+      <w:proofErr w:type="spellEnd"/>
+      <w:r>
+        <w:rPr>
+          <w:rFonts w:hint="eastAsia"/>
+        </w:rPr>
+        <w:t>文件</w:t>
       </w:r>
     </w:p>
     <w:p>
@@ -1373,7 +1806,35 @@
         <w:rPr>
           <w:rFonts w:hint="eastAsia"/>
         </w:rPr>
-        <w:t>、湖泊面shp与上一步得到的水深tif，通过计算得到湖盆区域的高程</w:t>
+        <w:t>、湖泊面</w:t>
+      </w:r>
+      <w:proofErr w:type="spellStart"/>
+      <w:r>
+        <w:rPr>
+          <w:rFonts w:hint="eastAsia"/>
+        </w:rPr>
+        <w:t>shp</w:t>
+      </w:r>
+      <w:proofErr w:type="spellEnd"/>
+      <w:r>
+        <w:rPr>
+          <w:rFonts w:hint="eastAsia"/>
+        </w:rPr>
+        <w:t>与上一步得到的水深</w:t>
+      </w:r>
+      <w:proofErr w:type="spellStart"/>
+      <w:r>
+        <w:rPr>
+          <w:rFonts w:hint="eastAsia"/>
+        </w:rPr>
+        <w:t>tif</w:t>
+      </w:r>
+      <w:proofErr w:type="spellEnd"/>
+      <w:r>
+        <w:rPr>
+          <w:rFonts w:hint="eastAsia"/>
+        </w:rPr>
+        <w:t>，通过计算得到湖盆区域的高程</w:t>
       </w:r>
       <w:r>
         <w:rPr>
@@ -1414,6 +1875,7 @@
     <w:p>
       <w:pPr>
         <w:rPr>
+          <w:rFonts w:hint="eastAsia"/>
           <w:b/>
           <w:bCs/>
         </w:rPr>
@@ -1447,6 +1909,7 @@
         <w:rPr>
           <w:b/>
           <w:bCs/>
+          <w:noProof/>
         </w:rPr>
         <w:drawing>
           <wp:inline distT="0" distB="0" distL="0" distR="0" wp14:anchorId="0A29219F" wp14:editId="7554BF24">
@@ -1570,6 +2033,9 @@
         <w:tabs>
           <w:tab w:val="left" w:pos="615"/>
         </w:tabs>
+        <w:rPr>
+          <w:rFonts w:hint="eastAsia"/>
+        </w:rPr>
       </w:pPr>
       <w:r>
         <w:rPr>
@@ -1583,6 +2049,9 @@
         <w:tabs>
           <w:tab w:val="left" w:pos="615"/>
         </w:tabs>
+        <w:rPr>
+          <w:rFonts w:hint="eastAsia"/>
+        </w:rPr>
       </w:pPr>
     </w:p>
     <w:p>
@@ -1590,6 +2059,9 @@
         <w:tabs>
           <w:tab w:val="left" w:pos="615"/>
         </w:tabs>
+        <w:rPr>
+          <w:rFonts w:hint="eastAsia"/>
+        </w:rPr>
       </w:pPr>
     </w:p>
     <w:p>
@@ -1597,6 +2069,9 @@
         <w:tabs>
           <w:tab w:val="left" w:pos="615"/>
         </w:tabs>
+        <w:rPr>
+          <w:rFonts w:hint="eastAsia"/>
+        </w:rPr>
       </w:pPr>
     </w:p>
     <w:p>
@@ -1710,13 +2185,55 @@
         <w:rPr>
           <w:rFonts w:hint="eastAsia"/>
         </w:rPr>
-        <w:t>与湖泊面shp，计算的到该湖泊预测的水储量。如果不设置湖泊面shp也可设置统一的岸线高程</w:t>
-      </w:r>
-      <w:r>
-        <w:rPr>
-          <w:rFonts w:hint="eastAsia"/>
-        </w:rPr>
-        <w:t>（二者均设置的情况下会优先采用shp）</w:t>
+        <w:t>与湖泊面</w:t>
+      </w:r>
+      <w:proofErr w:type="spellStart"/>
+      <w:r>
+        <w:rPr>
+          <w:rFonts w:hint="eastAsia"/>
+        </w:rPr>
+        <w:t>shp</w:t>
+      </w:r>
+      <w:proofErr w:type="spellEnd"/>
+      <w:r>
+        <w:rPr>
+          <w:rFonts w:hint="eastAsia"/>
+        </w:rPr>
+        <w:t>，计算的到该湖泊预测的水储量。如果不设置湖泊面</w:t>
+      </w:r>
+      <w:proofErr w:type="spellStart"/>
+      <w:r>
+        <w:rPr>
+          <w:rFonts w:hint="eastAsia"/>
+        </w:rPr>
+        <w:t>shp</w:t>
+      </w:r>
+      <w:proofErr w:type="spellEnd"/>
+      <w:r>
+        <w:rPr>
+          <w:rFonts w:hint="eastAsia"/>
+        </w:rPr>
+        <w:t>也可设置统一的岸线高程</w:t>
+      </w:r>
+      <w:r>
+        <w:rPr>
+          <w:rFonts w:hint="eastAsia"/>
+        </w:rPr>
+        <w:t>（二者均设置的情况下会优先采用</w:t>
+      </w:r>
+      <w:proofErr w:type="spellStart"/>
+      <w:r>
+        <w:rPr>
+          <w:rFonts w:hint="eastAsia"/>
+        </w:rPr>
+        <w:t>shp</w:t>
+      </w:r>
+      <w:proofErr w:type="spellEnd"/>
+      <w:r>
+        <w:rPr>
+          <w:rFonts w:hint="eastAsia"/>
+        </w:rPr>
+        <w:t>）</w:t>
       </w:r>
     </w:p>
     <w:p>
@@ -1745,6 +2262,7 @@
     <w:p>
       <w:pPr>
         <w:rPr>
+          <w:rFonts w:hint="eastAsia"/>
           <w:b/>
           <w:bCs/>
         </w:rPr>
@@ -1770,6 +2288,7 @@
         <w:rPr>
           <w:b/>
           <w:bCs/>
+          <w:noProof/>
         </w:rPr>
         <w:drawing>
           <wp:inline distT="0" distB="0" distL="0" distR="0" wp14:anchorId="1096BCF2" wp14:editId="3F050066">
@@ -1840,6 +2359,11 @@
       </w:r>
     </w:p>
     <w:p>
+      <w:pPr>
+        <w:rPr>
+          <w:rFonts w:hint="eastAsia"/>
+        </w:rPr>
+      </w:pPr>
       <w:r>
         <w:t xml:space="preserve">This section calculates and plots the E-V diagram by setting the lake basin </w:t>
       </w:r>
@@ -1870,24 +2394,36 @@
       <w:pPr>
         <w:widowControl/>
         <w:jc w:val="left"/>
+        <w:rPr>
+          <w:rFonts w:hint="eastAsia"/>
+        </w:rPr>
       </w:pPr>
     </w:p>
     <w:p>
       <w:pPr>
         <w:widowControl/>
         <w:jc w:val="left"/>
+        <w:rPr>
+          <w:rFonts w:hint="eastAsia"/>
+        </w:rPr>
       </w:pPr>
     </w:p>
     <w:p>
       <w:pPr>
         <w:widowControl/>
         <w:jc w:val="left"/>
+        <w:rPr>
+          <w:rFonts w:hint="eastAsia"/>
+        </w:rPr>
       </w:pPr>
     </w:p>
     <w:p>
       <w:pPr>
         <w:widowControl/>
         <w:jc w:val="left"/>
+        <w:rPr>
+          <w:rFonts w:hint="eastAsia"/>
+        </w:rPr>
       </w:pPr>
     </w:p>
     <w:p>
@@ -1917,6 +2453,7 @@
     <w:p>
       <w:pPr>
         <w:rPr>
+          <w:rFonts w:hint="eastAsia"/>
           <w:b/>
           <w:bCs/>
         </w:rPr>
@@ -1942,6 +2479,7 @@
         <w:rPr>
           <w:b/>
           <w:bCs/>
+          <w:noProof/>
         </w:rPr>
         <w:drawing>
           <wp:inline distT="0" distB="0" distL="0" distR="0" wp14:anchorId="045D8669" wp14:editId="14CBB17B">
@@ -2096,7 +2634,21 @@
         <w:rPr>
           <w:rFonts w:hint="eastAsia"/>
         </w:rPr>
-        <w:t>该功能通过设置实测点shp、预测得到的湖盆</w:t>
+        <w:t>该功能通过设置实测点</w:t>
+      </w:r>
+      <w:proofErr w:type="spellStart"/>
+      <w:r>
+        <w:rPr>
+          <w:rFonts w:hint="eastAsia"/>
+        </w:rPr>
+        <w:t>shp</w:t>
+      </w:r>
+      <w:proofErr w:type="spellEnd"/>
+      <w:r>
+        <w:rPr>
+          <w:rFonts w:hint="eastAsia"/>
+        </w:rPr>
+        <w:t>、预测得到的湖盆</w:t>
       </w:r>
       <w:r>
         <w:rPr>
@@ -2120,7 +2672,21 @@
         <w:rPr>
           <w:rFonts w:hint="eastAsia"/>
         </w:rPr>
-        <w:t>，设置实测点shp中水深字段名，最后验证沿实测线的预测精度分布情况，输出结果txt。</w:t>
+        <w:t>，设置实测点</w:t>
+      </w:r>
+      <w:proofErr w:type="spellStart"/>
+      <w:r>
+        <w:rPr>
+          <w:rFonts w:hint="eastAsia"/>
+        </w:rPr>
+        <w:t>shp</w:t>
+      </w:r>
+      <w:proofErr w:type="spellEnd"/>
+      <w:r>
+        <w:rPr>
+          <w:rFonts w:hint="eastAsia"/>
+        </w:rPr>
+        <w:t>中水深字段名，最后验证沿实测线的预测精度分布情况，输出结果txt。</w:t>
       </w:r>
     </w:p>
     <w:p>
@@ -2927,6 +3493,7 @@
   <w:style w:type="character" w:default="1" w:styleId="a0">
     <w:name w:val="Default Paragraph Font"/>
     <w:uiPriority w:val="1"/>
+    <w:semiHidden/>
     <w:unhideWhenUsed/>
   </w:style>
   <w:style w:type="table" w:default="1" w:styleId="a1">

</xml_diff>

<commit_message>
modified:   A_PredictedPoints_Gen.py 	modified:   B_Depth_Prediction.py 	modified:   Common_Function.py 	modified:   User_guide.docx 	modified:   User_guide.pdf 	new file:   app_version.py 	modified:   build_release.bat 	modified:   dem_builder.py 	new file:   dem_mosaic.py 	modified:   rasterProcessing.py 	modified:   ui/dialogs/bathymetry_dialog.py 	modified:   ui/dialogs/preprocess_dialog.py 	modified:   ui/main_window.py 	modified:   ui/pages/page_bathymetry.py 	modified:   ui/pages/page_preprocess.py 	modified:   ui/pages/page_volume.py 	new file:   version_info.txt 	modified:   "\346\233\264\346\226\260\346\227\245\345\277\227.txt"
</commit_message>
<xml_diff>
--- a/User_guide.docx
+++ b/User_guide.docx
@@ -1,6 +1,6 @@
 
 <file path=word/document.xml><?xml version="1.0" encoding="utf-8"?>
-<w:document xmlns:wpc="http://schemas.microsoft.com/office/word/2010/wordprocessingCanvas" xmlns:cx="http://schemas.microsoft.com/office/drawing/2014/chartex" xmlns:cx1="http://schemas.microsoft.com/office/drawing/2015/9/8/chartex" xmlns:cx2="http://schemas.microsoft.com/office/drawing/2015/10/21/chartex" xmlns:cx3="http://schemas.microsoft.com/office/drawing/2016/5/9/chartex" xmlns:cx4="http://schemas.microsoft.com/office/drawing/2016/5/10/chartex" xmlns:cx5="http://schemas.microsoft.com/office/drawing/2016/5/11/chartex" xmlns:cx6="http://schemas.microsoft.com/office/drawing/2016/5/12/chartex" xmlns:cx7="http://schemas.microsoft.com/office/drawing/2016/5/13/chartex" xmlns:cx8="http://schemas.microsoft.com/office/drawing/2016/5/14/chartex" xmlns:mc="http://schemas.openxmlformats.org/markup-compatibility/2006" xmlns:aink="http://schemas.microsoft.com/office/drawing/2016/ink" xmlns:am3d="http://schemas.microsoft.com/office/drawing/2017/model3d" xmlns:o="urn:schemas-microsoft-com:office:office" xmlns:oel="http://schemas.microsoft.com/office/2019/extlst" xmlns:r="http://schemas.openxmlformats.org/officeDocument/2006/relationships" xmlns:m="http://schemas.openxmlformats.org/officeDocument/2006/math" xmlns:v="urn:schemas-microsoft-com:vml" xmlns:wp14="http://schemas.microsoft.com/office/word/2010/wordprocessingDrawing" xmlns:wp="http://schemas.openxmlformats.org/drawingml/2006/wordprocessingDrawing" xmlns:w10="urn:schemas-microsoft-com:office:word" xmlns:w="http://schemas.openxmlformats.org/wordprocessingml/2006/main" xmlns:w14="http://schemas.microsoft.com/office/word/2010/wordml" xmlns:w15="http://schemas.microsoft.com/office/word/2012/wordml" xmlns:w16cei="http://schemas.microsoft.com/office/word/2026/wordml/cei" xmlns:w16cex="http://schemas.microsoft.com/office/word/2018/wordml/cex" xmlns:w16cid="http://schemas.microsoft.com/office/word/2016/wordml/cid" xmlns:w16="http://schemas.microsoft.com/office/word/2018/wordml" xmlns:w16du="http://schemas.microsoft.com/office/word/2023/wordml/word16du" xmlns:w16sdtdh="http://schemas.microsoft.com/office/word/2020/wordml/sdtdatahash" xmlns:w16sdtfl="http://schemas.microsoft.com/office/word/2024/wordml/sdtformatlock" xmlns:w16se="http://schemas.microsoft.com/office/word/2015/wordml/symex" xmlns:wpg="http://schemas.microsoft.com/office/word/2010/wordprocessingGroup" xmlns:wpi="http://schemas.microsoft.com/office/word/2010/wordprocessingInk" xmlns:wne="http://schemas.microsoft.com/office/word/2006/wordml" xmlns:wps="http://schemas.microsoft.com/office/word/2010/wordprocessingShape" mc:Ignorable="w14 w15 w16se w16cid w16 w16cex w16sdtdh w16sdtfl w16du wp14">
+<w:document xmlns:wpc="http://schemas.microsoft.com/office/word/2010/wordprocessingCanvas" xmlns:cx="http://schemas.microsoft.com/office/drawing/2014/chartex" xmlns:cx1="http://schemas.microsoft.com/office/drawing/2015/9/8/chartex" xmlns:cx2="http://schemas.microsoft.com/office/drawing/2015/10/21/chartex" xmlns:cx3="http://schemas.microsoft.com/office/drawing/2016/5/9/chartex" xmlns:cx4="http://schemas.microsoft.com/office/drawing/2016/5/10/chartex" xmlns:cx5="http://schemas.microsoft.com/office/drawing/2016/5/11/chartex" xmlns:cx6="http://schemas.microsoft.com/office/drawing/2016/5/12/chartex" xmlns:cx7="http://schemas.microsoft.com/office/drawing/2016/5/13/chartex" xmlns:cx8="http://schemas.microsoft.com/office/drawing/2016/5/14/chartex" xmlns:mc="http://schemas.openxmlformats.org/markup-compatibility/2006" xmlns:aink="http://schemas.microsoft.com/office/drawing/2016/ink" xmlns:am3d="http://schemas.microsoft.com/office/drawing/2017/model3d" xmlns:o="urn:schemas-microsoft-com:office:office" xmlns:oel="http://schemas.microsoft.com/office/2019/extlst" xmlns:r="http://schemas.openxmlformats.org/officeDocument/2006/relationships" xmlns:m="http://schemas.openxmlformats.org/officeDocument/2006/math" xmlns:v="urn:schemas-microsoft-com:vml" xmlns:wp14="http://schemas.microsoft.com/office/word/2010/wordprocessingDrawing" xmlns:wp="http://schemas.openxmlformats.org/drawingml/2006/wordprocessingDrawing" xmlns:w10="urn:schemas-microsoft-com:office:word" xmlns:w="http://schemas.openxmlformats.org/wordprocessingml/2006/main" xmlns:w14="http://schemas.microsoft.com/office/word/2010/wordml" xmlns:w15="http://schemas.microsoft.com/office/word/2012/wordml" xmlns:w16cex="http://schemas.microsoft.com/office/word/2018/wordml/cex" xmlns:w16cid="http://schemas.microsoft.com/office/word/2016/wordml/cid" xmlns:w16="http://schemas.microsoft.com/office/word/2018/wordml" xmlns:w16du="http://schemas.microsoft.com/office/word/2023/wordml/word16du" xmlns:w16sdtdh="http://schemas.microsoft.com/office/word/2020/wordml/sdtdatahash" xmlns:w16sdtfl="http://schemas.microsoft.com/office/word/2024/wordml/sdtformatlock" xmlns:w16se="http://schemas.microsoft.com/office/word/2015/wordml/symex" xmlns:wpg="http://schemas.microsoft.com/office/word/2010/wordprocessingGroup" xmlns:wpi="http://schemas.microsoft.com/office/word/2010/wordprocessingInk" xmlns:wne="http://schemas.microsoft.com/office/word/2006/wordml" xmlns:wps="http://schemas.microsoft.com/office/word/2010/wordprocessingShape" mc:Ignorable="w14 w15 w16se w16cid w16 w16cex w16sdtdh w16sdtfl w16du wp14">
   <w:body>
     <w:p>
       <w:pPr>
@@ -126,14 +126,11 @@
         </w:rPr>
       </w:pPr>
       <w:r>
-        <w:rPr>
-          <w:noProof/>
-        </w:rPr>
         <w:drawing>
-          <wp:inline distT="0" distB="0" distL="0" distR="0" wp14:anchorId="3A43C731" wp14:editId="5E61456C">
-            <wp:extent cx="5274310" cy="2759075"/>
-            <wp:effectExtent l="0" t="0" r="2540" b="3175"/>
-            <wp:docPr id="2009437140" name="图片 1"/>
+          <wp:inline distT="0" distB="0" distL="0" distR="0" wp14:anchorId="2914B67D" wp14:editId="24FC697A">
+            <wp:extent cx="5274310" cy="2758440"/>
+            <wp:effectExtent l="0" t="0" r="2540" b="3810"/>
+            <wp:docPr id="897315813" name="图片 1"/>
             <wp:cNvGraphicFramePr>
               <a:graphicFrameLocks xmlns:a="http://schemas.openxmlformats.org/drawingml/2006/main" noChangeAspect="1"/>
             </wp:cNvGraphicFramePr>
@@ -141,7 +138,7 @@
               <a:graphicData uri="http://schemas.openxmlformats.org/drawingml/2006/picture">
                 <pic:pic xmlns:pic="http://schemas.openxmlformats.org/drawingml/2006/picture">
                   <pic:nvPicPr>
-                    <pic:cNvPr id="2009437140" name=""/>
+                    <pic:cNvPr id="897315813" name=""/>
                     <pic:cNvPicPr/>
                   </pic:nvPicPr>
                   <pic:blipFill>
@@ -153,7 +150,7 @@
                   <pic:spPr>
                     <a:xfrm>
                       <a:off x="0" y="0"/>
-                      <a:ext cx="5274310" cy="2759075"/>
+                      <a:ext cx="5274310" cy="2758440"/>
                     </a:xfrm>
                     <a:prstGeom prst="rect">
                       <a:avLst/>
@@ -431,387 +428,6 @@
           <w:b/>
           <w:bCs/>
         </w:rPr>
-        <w:t>Water extraction</w:t>
-      </w:r>
-    </w:p>
-    <w:p>
-      <w:pPr>
-        <w:rPr>
-          <w:rFonts w:hint="eastAsia"/>
-        </w:rPr>
-      </w:pPr>
-      <w:r>
-        <w:rPr>
-          <w:noProof/>
-        </w:rPr>
-        <w:drawing>
-          <wp:inline distT="0" distB="0" distL="0" distR="0" wp14:anchorId="63A52BE4" wp14:editId="422A1A0F">
-            <wp:extent cx="3309792" cy="1981252"/>
-            <wp:effectExtent l="0" t="0" r="5080" b="0"/>
-            <wp:docPr id="640835666" name="图片 1"/>
-            <wp:cNvGraphicFramePr>
-              <a:graphicFrameLocks xmlns:a="http://schemas.openxmlformats.org/drawingml/2006/main" noChangeAspect="1"/>
-            </wp:cNvGraphicFramePr>
-            <a:graphic xmlns:a="http://schemas.openxmlformats.org/drawingml/2006/main">
-              <a:graphicData uri="http://schemas.openxmlformats.org/drawingml/2006/picture">
-                <pic:pic xmlns:pic="http://schemas.openxmlformats.org/drawingml/2006/picture">
-                  <pic:nvPicPr>
-                    <pic:cNvPr id="640835666" name=""/>
-                    <pic:cNvPicPr/>
-                  </pic:nvPicPr>
-                  <pic:blipFill>
-                    <a:blip r:embed="rId9"/>
-                    <a:stretch>
-                      <a:fillRect/>
-                    </a:stretch>
-                  </pic:blipFill>
-                  <pic:spPr>
-                    <a:xfrm>
-                      <a:off x="0" y="0"/>
-                      <a:ext cx="3323261" cy="1989314"/>
-                    </a:xfrm>
-                    <a:prstGeom prst="rect">
-                      <a:avLst/>
-                    </a:prstGeom>
-                  </pic:spPr>
-                </pic:pic>
-              </a:graphicData>
-            </a:graphic>
-          </wp:inline>
-        </w:drawing>
-      </w:r>
-    </w:p>
-    <w:p>
-      <w:pPr>
-        <w:rPr>
-          <w:rFonts w:hint="eastAsia"/>
-        </w:rPr>
-      </w:pPr>
-      <w:r>
-        <w:rPr>
-          <w:rFonts w:hint="eastAsia"/>
-        </w:rPr>
-        <w:t>该功能用于提取栅格形式的水体</w:t>
-      </w:r>
-      <w:r>
-        <w:rPr>
-          <w:rFonts w:hint="eastAsia"/>
-        </w:rPr>
-        <w:t>二值</w:t>
-      </w:r>
-      <w:r>
-        <w:rPr>
-          <w:rFonts w:hint="eastAsia"/>
-        </w:rPr>
-        <w:t>范围，</w:t>
-      </w:r>
-      <w:r>
-        <w:rPr>
-          <w:rFonts w:hint="eastAsia"/>
-        </w:rPr>
-        <w:t>输入预先准备好的地形</w:t>
-      </w:r>
-      <w:r>
-        <w:rPr>
-          <w:rFonts w:hint="eastAsia"/>
-        </w:rPr>
-        <w:t>DEM</w:t>
-      </w:r>
-      <w:r>
-        <w:rPr>
-          <w:rFonts w:hint="eastAsia"/>
-        </w:rPr>
-        <w:t>与湖泊面</w:t>
-      </w:r>
-      <w:proofErr w:type="spellStart"/>
-      <w:r>
-        <w:rPr>
-          <w:rFonts w:hint="eastAsia"/>
-        </w:rPr>
-        <w:t>shp</w:t>
-      </w:r>
-      <w:proofErr w:type="spellEnd"/>
-      <w:r>
-        <w:rPr>
-          <w:rFonts w:hint="eastAsia"/>
-        </w:rPr>
-        <w:t>，</w:t>
-      </w:r>
-      <w:r>
-        <w:rPr>
-          <w:rFonts w:hint="eastAsia"/>
-        </w:rPr>
-        <w:t>输</w:t>
-      </w:r>
-      <w:r>
-        <w:rPr>
-          <w:rFonts w:hint="eastAsia"/>
-        </w:rPr>
-        <w:lastRenderedPageBreak/>
-        <w:t>出</w:t>
-      </w:r>
-      <w:r>
-        <w:rPr>
-          <w:rFonts w:hint="eastAsia"/>
-        </w:rPr>
-        <w:t>二值湖泊范围</w:t>
-      </w:r>
-      <w:proofErr w:type="spellStart"/>
-      <w:r>
-        <w:rPr>
-          <w:rFonts w:hint="eastAsia"/>
-        </w:rPr>
-        <w:t>tif</w:t>
-      </w:r>
-      <w:proofErr w:type="spellEnd"/>
-      <w:r>
-        <w:rPr>
-          <w:rFonts w:hint="eastAsia"/>
-        </w:rPr>
-        <w:t xml:space="preserve"> </w:t>
-      </w:r>
-      <w:proofErr w:type="gramStart"/>
-      <w:r>
-        <w:rPr>
-          <w:rFonts w:hint="eastAsia"/>
-        </w:rPr>
-        <w:t>(</w:t>
-      </w:r>
-      <w:proofErr w:type="spellStart"/>
-      <w:r>
-        <w:rPr>
-          <w:rFonts w:hint="eastAsia"/>
-        </w:rPr>
-        <w:t>name</w:t>
-      </w:r>
-      <w:r>
-        <w:rPr>
-          <w:rFonts w:hint="eastAsia"/>
-        </w:rPr>
-        <w:t>_extent.tif</w:t>
-      </w:r>
-      <w:proofErr w:type="spellEnd"/>
-      <w:r>
-        <w:rPr>
-          <w:rFonts w:hint="eastAsia"/>
-        </w:rPr>
-        <w:t>)</w:t>
-      </w:r>
-      <w:proofErr w:type="gramEnd"/>
-    </w:p>
-    <w:p>
-      <w:pPr>
-        <w:rPr>
-          <w:rFonts w:hint="eastAsia"/>
-        </w:rPr>
-      </w:pPr>
-      <w:r>
-        <w:t>This function is used to extract the binary range of water bodies in raster format.</w:t>
-      </w:r>
-      <w:r>
-        <w:t xml:space="preserve"> It takes a pre-prepared terrain </w:t>
-      </w:r>
-      <w:r>
-        <w:t>DEM</w:t>
-      </w:r>
-      <w:r>
-        <w:t xml:space="preserve"> and lake polygon SHP as input, and outputs a binary lake boundary TIF</w:t>
-      </w:r>
-      <w:r>
-        <w:rPr>
-          <w:rFonts w:hint="eastAsia"/>
-        </w:rPr>
-        <w:t xml:space="preserve"> </w:t>
-      </w:r>
-      <w:r>
-        <w:rPr>
-          <w:rFonts w:hint="eastAsia"/>
-        </w:rPr>
-        <w:t>(</w:t>
-      </w:r>
-      <w:proofErr w:type="spellStart"/>
-      <w:r>
-        <w:rPr>
-          <w:rFonts w:hint="eastAsia"/>
-        </w:rPr>
-        <w:t>name_extent.tif</w:t>
-      </w:r>
-      <w:proofErr w:type="spellEnd"/>
-      <w:r>
-        <w:rPr>
-          <w:rFonts w:hint="eastAsia"/>
-        </w:rPr>
-        <w:t>)</w:t>
-      </w:r>
-      <w:r>
-        <w:t>.</w:t>
-      </w:r>
-    </w:p>
-    <w:p>
-      <w:pPr>
-        <w:rPr>
-          <w:rFonts w:hint="eastAsia"/>
-        </w:rPr>
-      </w:pPr>
-    </w:p>
-    <w:p>
-      <w:pPr>
-        <w:rPr>
-          <w:rFonts w:hint="eastAsia"/>
-          <w:b/>
-          <w:bCs/>
-        </w:rPr>
-      </w:pPr>
-      <w:r>
-        <w:rPr>
-          <w:rFonts w:hint="eastAsia"/>
-          <w:b/>
-          <w:bCs/>
-        </w:rPr>
-        <w:t>Shoreline generation</w:t>
-      </w:r>
-    </w:p>
-    <w:p>
-      <w:pPr>
-        <w:rPr>
-          <w:rFonts w:hint="eastAsia"/>
-        </w:rPr>
-      </w:pPr>
-      <w:r>
-        <w:rPr>
-          <w:noProof/>
-        </w:rPr>
-        <w:drawing>
-          <wp:inline distT="0" distB="0" distL="0" distR="0" wp14:anchorId="3BA201A2" wp14:editId="5D19D0A8">
-            <wp:extent cx="3337841" cy="2115386"/>
-            <wp:effectExtent l="0" t="0" r="0" b="0"/>
-            <wp:docPr id="1529954653" name="图片 1"/>
-            <wp:cNvGraphicFramePr>
-              <a:graphicFrameLocks xmlns:a="http://schemas.openxmlformats.org/drawingml/2006/main" noChangeAspect="1"/>
-            </wp:cNvGraphicFramePr>
-            <a:graphic xmlns:a="http://schemas.openxmlformats.org/drawingml/2006/main">
-              <a:graphicData uri="http://schemas.openxmlformats.org/drawingml/2006/picture">
-                <pic:pic xmlns:pic="http://schemas.openxmlformats.org/drawingml/2006/picture">
-                  <pic:nvPicPr>
-                    <pic:cNvPr id="1529954653" name=""/>
-                    <pic:cNvPicPr/>
-                  </pic:nvPicPr>
-                  <pic:blipFill>
-                    <a:blip r:embed="rId10"/>
-                    <a:stretch>
-                      <a:fillRect/>
-                    </a:stretch>
-                  </pic:blipFill>
-                  <pic:spPr>
-                    <a:xfrm>
-                      <a:off x="0" y="0"/>
-                      <a:ext cx="3347745" cy="2121663"/>
-                    </a:xfrm>
-                    <a:prstGeom prst="rect">
-                      <a:avLst/>
-                    </a:prstGeom>
-                  </pic:spPr>
-                </pic:pic>
-              </a:graphicData>
-            </a:graphic>
-          </wp:inline>
-        </w:drawing>
-      </w:r>
-    </w:p>
-    <w:p>
-      <w:pPr>
-        <w:rPr>
-          <w:rFonts w:hint="eastAsia"/>
-        </w:rPr>
-      </w:pPr>
-      <w:r>
-        <w:rPr>
-          <w:rFonts w:hint="eastAsia"/>
-        </w:rPr>
-        <w:t>该功能从读取的湖泊面</w:t>
-      </w:r>
-      <w:proofErr w:type="spellStart"/>
-      <w:r>
-        <w:rPr>
-          <w:rFonts w:hint="eastAsia"/>
-        </w:rPr>
-        <w:t>shp</w:t>
-      </w:r>
-      <w:proofErr w:type="spellEnd"/>
-      <w:r>
-        <w:rPr>
-          <w:rFonts w:hint="eastAsia"/>
-        </w:rPr>
-        <w:t>提取得到湖泊边缘线</w:t>
-      </w:r>
-      <w:proofErr w:type="spellStart"/>
-      <w:r>
-        <w:rPr>
-          <w:rFonts w:hint="eastAsia"/>
-        </w:rPr>
-        <w:t>shp</w:t>
-      </w:r>
-      <w:proofErr w:type="spellEnd"/>
-      <w:r>
-        <w:rPr>
-          <w:rFonts w:hint="eastAsia"/>
-        </w:rPr>
-        <w:t xml:space="preserve"> </w:t>
-      </w:r>
-      <w:proofErr w:type="gramStart"/>
-      <w:r>
-        <w:rPr>
-          <w:rFonts w:hint="eastAsia"/>
-        </w:rPr>
-        <w:t>(</w:t>
-      </w:r>
-      <w:proofErr w:type="spellStart"/>
-      <w:r>
-        <w:rPr>
-          <w:rFonts w:hint="eastAsia"/>
-        </w:rPr>
-        <w:t>shoreline.shp</w:t>
-      </w:r>
-      <w:proofErr w:type="spellEnd"/>
-      <w:r>
-        <w:rPr>
-          <w:rFonts w:hint="eastAsia"/>
-        </w:rPr>
-        <w:t>)</w:t>
-      </w:r>
-      <w:proofErr w:type="gramEnd"/>
-    </w:p>
-    <w:p>
-      <w:pPr>
-        <w:rPr>
-          <w:rFonts w:hint="eastAsia"/>
-        </w:rPr>
-      </w:pPr>
-      <w:r>
-        <w:t>This function extracts the lake shoreline SHP from the read lake surface SHP.</w:t>
-      </w:r>
-    </w:p>
-    <w:p>
-      <w:pPr>
-        <w:rPr>
-          <w:rFonts w:hint="eastAsia"/>
-        </w:rPr>
-      </w:pPr>
-    </w:p>
-    <w:p>
-      <w:pPr>
-        <w:rPr>
-          <w:rFonts w:hint="eastAsia"/>
-          <w:b/>
-          <w:bCs/>
-        </w:rPr>
-      </w:pPr>
-      <w:r>
-        <w:rPr>
-          <w:rFonts w:hint="eastAsia"/>
-          <w:b/>
-          <w:bCs/>
-        </w:rPr>
         <w:t>Buffer full process</w:t>
       </w:r>
     </w:p>
@@ -841,7 +457,7 @@
                     <pic:cNvPicPr/>
                   </pic:nvPicPr>
                   <pic:blipFill>
-                    <a:blip r:embed="rId11"/>
+                    <a:blip r:embed="rId9"/>
                     <a:stretch>
                       <a:fillRect/>
                     </a:stretch>
@@ -898,7 +514,14 @@
         <w:rPr>
           <w:rFonts w:hint="eastAsia"/>
         </w:rPr>
-        <w:t>数据，设置缓冲区宽度后输出：1.包含缓冲区的湖泊面</w:t>
+        <w:t>数据，设置缓冲区宽度后输出：1.包含缓冲区的</w:t>
+      </w:r>
+      <w:r>
+        <w:rPr>
+          <w:rFonts w:hint="eastAsia"/>
+        </w:rPr>
+        <w:lastRenderedPageBreak/>
+        <w:t>湖泊面</w:t>
       </w:r>
       <w:proofErr w:type="spellStart"/>
       <w:r>
@@ -1020,6 +643,114 @@
         <w:t>)</w:t>
       </w:r>
       <w:proofErr w:type="gramEnd"/>
+      <w:r>
+        <w:rPr>
+          <w:rFonts w:hint="eastAsia"/>
+        </w:rPr>
+        <w:t xml:space="preserve"> 4.</w:t>
+      </w:r>
+      <w:r>
+        <w:rPr>
+          <w:rFonts w:hint="eastAsia"/>
+        </w:rPr>
+        <w:t xml:space="preserve"> </w:t>
+      </w:r>
+      <w:r>
+        <w:rPr>
+          <w:rFonts w:hint="eastAsia"/>
+        </w:rPr>
+        <w:t>湖泊边缘线</w:t>
+      </w:r>
+      <w:proofErr w:type="spellStart"/>
+      <w:r>
+        <w:rPr>
+          <w:rFonts w:hint="eastAsia"/>
+        </w:rPr>
+        <w:t>shp</w:t>
+      </w:r>
+      <w:proofErr w:type="spellEnd"/>
+      <w:r>
+        <w:rPr>
+          <w:rFonts w:hint="eastAsia"/>
+        </w:rPr>
+        <w:t xml:space="preserve"> </w:t>
+      </w:r>
+      <w:proofErr w:type="gramStart"/>
+      <w:r>
+        <w:rPr>
+          <w:rFonts w:hint="eastAsia"/>
+        </w:rPr>
+        <w:t>(</w:t>
+      </w:r>
+      <w:proofErr w:type="spellStart"/>
+      <w:r>
+        <w:rPr>
+          <w:rFonts w:hint="eastAsia"/>
+        </w:rPr>
+        <w:t>shoreline.shp</w:t>
+      </w:r>
+      <w:proofErr w:type="spellEnd"/>
+      <w:r>
+        <w:rPr>
+          <w:rFonts w:hint="eastAsia"/>
+        </w:rPr>
+        <w:t>)</w:t>
+      </w:r>
+      <w:proofErr w:type="gramEnd"/>
+      <w:r>
+        <w:rPr>
+          <w:rFonts w:hint="eastAsia"/>
+        </w:rPr>
+        <w:t xml:space="preserve"> 5.</w:t>
+      </w:r>
+      <w:r>
+        <w:rPr>
+          <w:rFonts w:hint="eastAsia"/>
+        </w:rPr>
+        <w:t xml:space="preserve"> </w:t>
+      </w:r>
+      <w:r>
+        <w:rPr>
+          <w:rFonts w:hint="eastAsia"/>
+        </w:rPr>
+        <w:t>二值湖泊范围</w:t>
+      </w:r>
+      <w:proofErr w:type="spellStart"/>
+      <w:r>
+        <w:rPr>
+          <w:rFonts w:hint="eastAsia"/>
+        </w:rPr>
+        <w:t>tif</w:t>
+      </w:r>
+      <w:proofErr w:type="spellEnd"/>
+      <w:r>
+        <w:rPr>
+          <w:rFonts w:hint="eastAsia"/>
+        </w:rPr>
+        <w:t xml:space="preserve"> </w:t>
+      </w:r>
+      <w:proofErr w:type="gramStart"/>
+      <w:r>
+        <w:rPr>
+          <w:rFonts w:hint="eastAsia"/>
+        </w:rPr>
+        <w:t>(</w:t>
+      </w:r>
+      <w:proofErr w:type="spellStart"/>
+      <w:r>
+        <w:rPr>
+          <w:rFonts w:hint="eastAsia"/>
+        </w:rPr>
+        <w:t>name_extent.tif</w:t>
+      </w:r>
+      <w:proofErr w:type="spellEnd"/>
+      <w:r>
+        <w:rPr>
+          <w:rFonts w:hint="eastAsia"/>
+        </w:rPr>
+        <w:t>)</w:t>
+      </w:r>
+      <w:proofErr w:type="gramEnd"/>
     </w:p>
     <w:p>
       <w:pPr>
@@ -1068,6 +799,31 @@
       <w:proofErr w:type="spellEnd"/>
       <w:r>
         <w:t>).</w:t>
+      </w:r>
+      <w:r>
+        <w:rPr>
+          <w:rFonts w:hint="eastAsia"/>
+        </w:rPr>
+        <w:t xml:space="preserve"> </w:t>
+      </w:r>
+      <w:r>
+        <w:t>4. Lake shoreline SHP (</w:t>
+      </w:r>
+      <w:proofErr w:type="spellStart"/>
+      <w:r>
+        <w:t>shoreline.shp</w:t>
+      </w:r>
+      <w:proofErr w:type="spellEnd"/>
+      <w:r>
+        <w:t>) 5. Binary lake extent TIF (</w:t>
+      </w:r>
+      <w:proofErr w:type="spellStart"/>
+      <w:r>
+        <w:t>name_extent.tif</w:t>
+      </w:r>
+      <w:proofErr w:type="spellEnd"/>
+      <w:r>
+        <w:t>)</w:t>
       </w:r>
     </w:p>
     <w:p>
@@ -1106,11 +862,10 @@
         <w:rPr>
           <w:noProof/>
         </w:rPr>
-        <w:lastRenderedPageBreak/>
         <w:drawing>
-          <wp:inline distT="0" distB="0" distL="0" distR="0" wp14:anchorId="1BBC9B83" wp14:editId="2969092F">
-            <wp:extent cx="3433208" cy="2211373"/>
-            <wp:effectExtent l="0" t="0" r="0" b="0"/>
+          <wp:inline distT="0" distB="0" distL="0" distR="0" wp14:anchorId="1BBC9B83" wp14:editId="7A3B58F6">
+            <wp:extent cx="3268101" cy="2105025"/>
+            <wp:effectExtent l="0" t="0" r="8890" b="0"/>
             <wp:docPr id="1211277475" name="图片 1"/>
             <wp:cNvGraphicFramePr>
               <a:graphicFrameLocks xmlns:a="http://schemas.openxmlformats.org/drawingml/2006/main" noChangeAspect="1"/>
@@ -1123,7 +878,7 @@
                     <pic:cNvPicPr/>
                   </pic:nvPicPr>
                   <pic:blipFill>
-                    <a:blip r:embed="rId12"/>
+                    <a:blip r:embed="rId10"/>
                     <a:stretch>
                       <a:fillRect/>
                     </a:stretch>
@@ -1131,7 +886,7 @@
                   <pic:spPr>
                     <a:xfrm>
                       <a:off x="0" y="0"/>
-                      <a:ext cx="3444354" cy="2218552"/>
+                      <a:ext cx="3281237" cy="2113486"/>
                     </a:xfrm>
                     <a:prstGeom prst="rect">
                       <a:avLst/>
@@ -1218,14 +973,11 @@
         </w:rPr>
       </w:pPr>
       <w:r>
-        <w:rPr>
-          <w:noProof/>
-        </w:rPr>
         <w:drawing>
-          <wp:inline distT="0" distB="0" distL="0" distR="0" wp14:anchorId="4E5A8381" wp14:editId="08B7D585">
-            <wp:extent cx="3349537" cy="2518807"/>
-            <wp:effectExtent l="0" t="0" r="3810" b="0"/>
-            <wp:docPr id="912968305" name="图片 1"/>
+          <wp:inline distT="0" distB="0" distL="0" distR="0" wp14:anchorId="0F9FC54F" wp14:editId="1B4981B8">
+            <wp:extent cx="3057525" cy="2155286"/>
+            <wp:effectExtent l="0" t="0" r="0" b="0"/>
+            <wp:docPr id="847804287" name="图片 1"/>
             <wp:cNvGraphicFramePr>
               <a:graphicFrameLocks xmlns:a="http://schemas.openxmlformats.org/drawingml/2006/main" noChangeAspect="1"/>
             </wp:cNvGraphicFramePr>
@@ -1233,7 +985,372 @@
               <a:graphicData uri="http://schemas.openxmlformats.org/drawingml/2006/picture">
                 <pic:pic xmlns:pic="http://schemas.openxmlformats.org/drawingml/2006/picture">
                   <pic:nvPicPr>
-                    <pic:cNvPr id="912968305" name=""/>
+                    <pic:cNvPr id="847804287" name=""/>
+                    <pic:cNvPicPr/>
+                  </pic:nvPicPr>
+                  <pic:blipFill>
+                    <a:blip r:embed="rId11"/>
+                    <a:stretch>
+                      <a:fillRect/>
+                    </a:stretch>
+                  </pic:blipFill>
+                  <pic:spPr>
+                    <a:xfrm>
+                      <a:off x="0" y="0"/>
+                      <a:ext cx="3063432" cy="2159450"/>
+                    </a:xfrm>
+                    <a:prstGeom prst="rect">
+                      <a:avLst/>
+                    </a:prstGeom>
+                  </pic:spPr>
+                </pic:pic>
+              </a:graphicData>
+            </a:graphic>
+          </wp:inline>
+        </w:drawing>
+      </w:r>
+    </w:p>
+    <w:p>
+      <w:pPr>
+        <w:rPr>
+          <w:rFonts w:hint="eastAsia"/>
+        </w:rPr>
+      </w:pPr>
+      <w:r>
+        <w:rPr>
+          <w:rFonts w:hint="eastAsia"/>
+        </w:rPr>
+        <w:t>该功能输入为工作空间路径，</w:t>
+      </w:r>
+      <w:r>
+        <w:rPr>
+          <w:rFonts w:hint="eastAsia"/>
+        </w:rPr>
+        <w:t>湖泊多边形</w:t>
+      </w:r>
+      <w:proofErr w:type="spellStart"/>
+      <w:r>
+        <w:rPr>
+          <w:rFonts w:hint="eastAsia"/>
+        </w:rPr>
+        <w:t>shp</w:t>
+      </w:r>
+      <w:proofErr w:type="spellEnd"/>
+      <w:r>
+        <w:rPr>
+          <w:rFonts w:hint="eastAsia"/>
+        </w:rPr>
+        <w:t>以及需要事先准备的实测测深点</w:t>
+      </w:r>
+      <w:proofErr w:type="spellStart"/>
+      <w:r>
+        <w:rPr>
+          <w:rFonts w:hint="eastAsia"/>
+        </w:rPr>
+        <w:t>shp</w:t>
+      </w:r>
+      <w:proofErr w:type="spellEnd"/>
+      <w:r>
+        <w:rPr>
+          <w:rFonts w:hint="eastAsia"/>
+        </w:rPr>
+        <w:t>，</w:t>
+      </w:r>
+      <w:r>
+        <w:rPr>
+          <w:rFonts w:hint="eastAsia"/>
+        </w:rPr>
+        <w:t>同时前置buffer full process必须运行，后台会自动读取该步骤生成的</w:t>
+      </w:r>
+      <w:proofErr w:type="spellStart"/>
+      <w:r>
+        <w:rPr>
+          <w:rFonts w:hint="eastAsia"/>
+        </w:rPr>
+        <w:t>merit.tif</w:t>
+      </w:r>
+      <w:proofErr w:type="spellEnd"/>
+      <w:r>
+        <w:rPr>
+          <w:rFonts w:hint="eastAsia"/>
+        </w:rPr>
+        <w:t>。</w:t>
+      </w:r>
+      <w:r>
+        <w:rPr>
+          <w:rFonts w:hint="eastAsia"/>
+        </w:rPr>
+        <w:t>在设置预测点相关参数后会计算</w:t>
+      </w:r>
+      <w:r>
+        <w:rPr>
+          <w:rFonts w:hint="eastAsia"/>
+        </w:rPr>
+        <w:t>并得到：1.MLData中用作后续训练的txt文件 2.tif格式的shoreline</w:t>
+      </w:r>
+      <w:r>
+        <w:rPr>
+          <w:rFonts w:hint="eastAsia"/>
+        </w:rPr>
+        <w:t>和</w:t>
+      </w:r>
+      <w:r>
+        <w:rPr>
+          <w:rFonts w:hint="eastAsia"/>
+        </w:rPr>
+        <w:t>实测点文件</w:t>
+      </w:r>
+    </w:p>
+    <w:p>
+      <w:r>
+        <w:lastRenderedPageBreak/>
+        <w:t>This function takes as input the workspace path, a lake polygon shapefile, and a pre-prepared measured bathymetric point shapefile. Additionally, the pre-processing step "buffer full process" must be run, as the system will automatically read the "</w:t>
+      </w:r>
+      <w:proofErr w:type="spellStart"/>
+      <w:r>
+        <w:t>merit.tif</w:t>
+      </w:r>
+      <w:proofErr w:type="spellEnd"/>
+      <w:r>
+        <w:t xml:space="preserve">" generated in that step. After setting the parameters for prediction points, the following outputs will be computed: 1. A TXT file in </w:t>
+      </w:r>
+      <w:proofErr w:type="spellStart"/>
+      <w:r>
+        <w:t>MLData</w:t>
+      </w:r>
+      <w:proofErr w:type="spellEnd"/>
+      <w:r>
+        <w:t xml:space="preserve"> for subsequent training; 2. Shoreline and measured point files in TIFF format.</w:t>
+      </w:r>
+    </w:p>
+    <w:p>
+      <w:pPr>
+        <w:rPr>
+          <w:rFonts w:hint="eastAsia"/>
+        </w:rPr>
+      </w:pPr>
+    </w:p>
+    <w:p>
+      <w:pPr>
+        <w:rPr>
+          <w:rFonts w:hint="eastAsia"/>
+          <w:b/>
+          <w:bCs/>
+        </w:rPr>
+      </w:pPr>
+      <w:r>
+        <w:rPr>
+          <w:rFonts w:hint="eastAsia"/>
+          <w:b/>
+          <w:bCs/>
+        </w:rPr>
+        <w:t>Gen. Prediction Depth</w:t>
+      </w:r>
+    </w:p>
+    <w:p>
+      <w:pPr>
+        <w:rPr>
+          <w:rFonts w:hint="eastAsia"/>
+        </w:rPr>
+      </w:pPr>
+      <w:r>
+        <w:drawing>
+          <wp:inline distT="0" distB="0" distL="0" distR="0" wp14:anchorId="1A44A9EF" wp14:editId="62E46E32">
+            <wp:extent cx="3057525" cy="2285966"/>
+            <wp:effectExtent l="0" t="0" r="0" b="635"/>
+            <wp:docPr id="655657034" name="图片 1"/>
+            <wp:cNvGraphicFramePr>
+              <a:graphicFrameLocks xmlns:a="http://schemas.openxmlformats.org/drawingml/2006/main" noChangeAspect="1"/>
+            </wp:cNvGraphicFramePr>
+            <a:graphic xmlns:a="http://schemas.openxmlformats.org/drawingml/2006/main">
+              <a:graphicData uri="http://schemas.openxmlformats.org/drawingml/2006/picture">
+                <pic:pic xmlns:pic="http://schemas.openxmlformats.org/drawingml/2006/picture">
+                  <pic:nvPicPr>
+                    <pic:cNvPr id="655657034" name=""/>
+                    <pic:cNvPicPr/>
+                  </pic:nvPicPr>
+                  <pic:blipFill>
+                    <a:blip r:embed="rId12"/>
+                    <a:stretch>
+                      <a:fillRect/>
+                    </a:stretch>
+                  </pic:blipFill>
+                  <pic:spPr>
+                    <a:xfrm>
+                      <a:off x="0" y="0"/>
+                      <a:ext cx="3061916" cy="2289249"/>
+                    </a:xfrm>
+                    <a:prstGeom prst="rect">
+                      <a:avLst/>
+                    </a:prstGeom>
+                  </pic:spPr>
+                </pic:pic>
+              </a:graphicData>
+            </a:graphic>
+          </wp:inline>
+        </w:drawing>
+      </w:r>
+    </w:p>
+    <w:p>
+      <w:pPr>
+        <w:rPr>
+          <w:rFonts w:hint="eastAsia"/>
+        </w:rPr>
+      </w:pPr>
+      <w:r>
+        <w:rPr>
+          <w:rFonts w:hint="eastAsia"/>
+        </w:rPr>
+        <w:t>该功能为机器学习生成预测点水深的主要模块，通过设置工作空间路径</w:t>
+      </w:r>
+      <w:r>
+        <w:rPr>
+          <w:rFonts w:hint="eastAsia"/>
+        </w:rPr>
+        <w:t>与实测点</w:t>
+      </w:r>
+      <w:proofErr w:type="spellStart"/>
+      <w:r>
+        <w:rPr>
+          <w:rFonts w:hint="eastAsia"/>
+        </w:rPr>
+        <w:t>shp</w:t>
+      </w:r>
+      <w:proofErr w:type="spellEnd"/>
+      <w:r>
+        <w:rPr>
+          <w:rFonts w:hint="eastAsia"/>
+        </w:rPr>
+        <w:t>，</w:t>
+      </w:r>
+      <w:r>
+        <w:rPr>
+          <w:rFonts w:hint="eastAsia"/>
+        </w:rPr>
+        <w:t>自动读取</w:t>
+      </w:r>
+      <w:proofErr w:type="spellStart"/>
+      <w:r>
+        <w:rPr>
+          <w:rFonts w:hint="eastAsia"/>
+        </w:rPr>
+        <w:t>MLData</w:t>
+      </w:r>
+      <w:proofErr w:type="spellEnd"/>
+      <w:r>
+        <w:rPr>
+          <w:rFonts w:hint="eastAsia"/>
+        </w:rPr>
+        <w:t>中前置文件与其余相关文件，设置全湖平均分布的预测点相关参数，</w:t>
+      </w:r>
+      <w:r>
+        <w:rPr>
+          <w:rFonts w:hint="eastAsia"/>
+        </w:rPr>
+        <w:t>选择机器学习模型后</w:t>
+      </w:r>
+      <w:r>
+        <w:rPr>
+          <w:rFonts w:hint="eastAsia"/>
+        </w:rPr>
+        <w:t>在多轮优化后得到最优结果，输出</w:t>
+      </w:r>
+      <w:proofErr w:type="spellStart"/>
+      <w:r>
+        <w:rPr>
+          <w:rFonts w:hint="eastAsia"/>
+        </w:rPr>
+        <w:t>temp_ML</w:t>
+      </w:r>
+      <w:proofErr w:type="spellEnd"/>
+      <w:r>
+        <w:rPr>
+          <w:rFonts w:hint="eastAsia"/>
+        </w:rPr>
+        <w:t>中的预测点</w:t>
+      </w:r>
+      <w:proofErr w:type="spellStart"/>
+      <w:r>
+        <w:rPr>
+          <w:rFonts w:hint="eastAsia"/>
+        </w:rPr>
+        <w:t>shp</w:t>
+      </w:r>
+      <w:proofErr w:type="spellEnd"/>
+    </w:p>
+    <w:p>
+      <w:pPr>
+        <w:rPr>
+          <w:rFonts w:hint="eastAsia"/>
+        </w:rPr>
+      </w:pPr>
+      <w:r>
+        <w:t xml:space="preserve">This function serves as the main module for generating predicted water depths via machine learning. By setting the workspace path and the measured points SHP file, it automatically reads the prerequisite files and other related files in </w:t>
+      </w:r>
+      <w:proofErr w:type="spellStart"/>
+      <w:r>
+        <w:t>MLData</w:t>
+      </w:r>
+      <w:proofErr w:type="spellEnd"/>
+      <w:r>
+        <w:t xml:space="preserve">. After configuring parameters for the prediction points evenly distributed across the entire lake and selecting a machine learning model, the optimal result is obtained through multiple rounds of optimization, and the predicted points SHP file is output to </w:t>
+      </w:r>
+      <w:proofErr w:type="spellStart"/>
+      <w:r>
+        <w:t>temp_ML</w:t>
+      </w:r>
+      <w:proofErr w:type="spellEnd"/>
+      <w:r>
+        <w:t>.</w:t>
+      </w:r>
+    </w:p>
+    <w:p>
+      <w:pPr>
+        <w:rPr>
+          <w:rFonts w:hint="eastAsia"/>
+        </w:rPr>
+      </w:pPr>
+    </w:p>
+    <w:p>
+      <w:pPr>
+        <w:rPr>
+          <w:rFonts w:hint="eastAsia"/>
+          <w:b/>
+          <w:bCs/>
+        </w:rPr>
+      </w:pPr>
+      <w:r>
+        <w:rPr>
+          <w:rFonts w:hint="eastAsia"/>
+          <w:b/>
+          <w:bCs/>
+        </w:rPr>
+        <w:t>Terrain generation</w:t>
+      </w:r>
+    </w:p>
+    <w:p>
+      <w:pPr>
+        <w:rPr>
+          <w:rFonts w:hint="eastAsia"/>
+        </w:rPr>
+      </w:pPr>
+      <w:r>
+        <w:rPr>
+          <w:noProof/>
+        </w:rPr>
+        <w:drawing>
+          <wp:inline distT="0" distB="0" distL="0" distR="0" wp14:anchorId="2A301395" wp14:editId="75CE32D7">
+            <wp:extent cx="3107903" cy="2442993"/>
+            <wp:effectExtent l="0" t="0" r="0" b="0"/>
+            <wp:docPr id="1075954119" name="图片 1"/>
+            <wp:cNvGraphicFramePr>
+              <a:graphicFrameLocks xmlns:a="http://schemas.openxmlformats.org/drawingml/2006/main" noChangeAspect="1"/>
+            </wp:cNvGraphicFramePr>
+            <a:graphic xmlns:a="http://schemas.openxmlformats.org/drawingml/2006/main">
+              <a:graphicData uri="http://schemas.openxmlformats.org/drawingml/2006/picture">
+                <pic:pic xmlns:pic="http://schemas.openxmlformats.org/drawingml/2006/picture">
+                  <pic:nvPicPr>
+                    <pic:cNvPr id="1075954119" name=""/>
                     <pic:cNvPicPr/>
                   </pic:nvPicPr>
                   <pic:blipFill>
@@ -1245,7 +1362,7 @@
                   <pic:spPr>
                     <a:xfrm>
                       <a:off x="0" y="0"/>
-                      <a:ext cx="3359874" cy="2526580"/>
+                      <a:ext cx="3118949" cy="2451676"/>
                     </a:xfrm>
                     <a:prstGeom prst="rect">
                       <a:avLst/>
@@ -1268,45 +1385,8 @@
         <w:rPr>
           <w:rFonts w:hint="eastAsia"/>
         </w:rPr>
-        <w:t>该功能输入为工作空间路径，可自选的地形</w:t>
-      </w:r>
-      <w:r>
-        <w:rPr>
-          <w:rFonts w:hint="eastAsia"/>
-        </w:rPr>
-        <w:t>DEM</w:t>
-      </w:r>
-      <w:r>
-        <w:rPr>
-          <w:rFonts w:hint="eastAsia"/>
-        </w:rPr>
-        <w:t>（如未指定会默认选择buffer full process</w:t>
-      </w:r>
-      <w:r>
-        <w:rPr>
-          <w:rFonts w:hint="eastAsia"/>
-        </w:rPr>
-        <w:t>中生成的</w:t>
-      </w:r>
-      <w:proofErr w:type="spellStart"/>
-      <w:r>
-        <w:rPr>
-          <w:rFonts w:hint="eastAsia"/>
-        </w:rPr>
-        <w:t>merit.tif</w:t>
-      </w:r>
-      <w:proofErr w:type="spellEnd"/>
-      <w:r>
-        <w:rPr>
-          <w:rFonts w:hint="eastAsia"/>
-        </w:rPr>
-        <w:t>）</w:t>
-      </w:r>
-      <w:r>
-        <w:rPr>
-          <w:rFonts w:hint="eastAsia"/>
-        </w:rPr>
-        <w:t>以及需要事先准备的实测测深点</w:t>
+        <w:lastRenderedPageBreak/>
+        <w:t>该功能通过利用生成的预测点</w:t>
       </w:r>
       <w:proofErr w:type="spellStart"/>
       <w:r>
@@ -1320,184 +1400,7 @@
         <w:rPr>
           <w:rFonts w:hint="eastAsia"/>
         </w:rPr>
-        <w:t>，在设置预测点相关参数后会计算</w:t>
-      </w:r>
-      <w:r>
-        <w:rPr>
-          <w:rFonts w:hint="eastAsia"/>
-        </w:rPr>
-        <w:t>并得到：1.MLData中用作后续训练的txt文件 2.tif格式的shoreline</w:t>
-      </w:r>
-      <w:r>
-        <w:rPr>
-          <w:rFonts w:hint="eastAsia"/>
-        </w:rPr>
-        <w:t>和</w:t>
-      </w:r>
-      <w:r>
-        <w:rPr>
-          <w:rFonts w:hint="eastAsia"/>
-        </w:rPr>
-        <w:t>实测点文件</w:t>
-      </w:r>
-    </w:p>
-    <w:p>
-      <w:pPr>
-        <w:rPr>
-          <w:rFonts w:hint="eastAsia"/>
-        </w:rPr>
-      </w:pPr>
-      <w:r>
-        <w:t xml:space="preserve">The input for this feature is the workspace path, an optional terrain </w:t>
-      </w:r>
-      <w:r>
-        <w:t>DEM</w:t>
-      </w:r>
-      <w:r>
-        <w:t xml:space="preserve"> (if not specified, the </w:t>
-      </w:r>
-      <w:proofErr w:type="spellStart"/>
-      <w:r>
-        <w:t>merit.tif</w:t>
-      </w:r>
-      <w:proofErr w:type="spellEnd"/>
-      <w:r>
-        <w:t xml:space="preserve"> generated in the buffer full process will be selected by default), and a pre-prepared measured bathymetric point SHP file. After setting the relevant parameters for the prediction points, it will calculate and generate: 1. A TXT file in </w:t>
-      </w:r>
-      <w:proofErr w:type="spellStart"/>
-      <w:r>
-        <w:t>MLData</w:t>
-      </w:r>
-      <w:proofErr w:type="spellEnd"/>
-      <w:r>
-        <w:t xml:space="preserve"> for subsequent training, and 2. Shoreline and measured point files in TIF format.</w:t>
-      </w:r>
-    </w:p>
-    <w:p>
-      <w:pPr>
-        <w:rPr>
-          <w:rFonts w:hint="eastAsia"/>
-        </w:rPr>
-      </w:pPr>
-    </w:p>
-    <w:p>
-      <w:pPr>
-        <w:rPr>
-          <w:rFonts w:hint="eastAsia"/>
-        </w:rPr>
-      </w:pPr>
-    </w:p>
-    <w:p>
-      <w:pPr>
-        <w:rPr>
-          <w:rFonts w:hint="eastAsia"/>
-        </w:rPr>
-      </w:pPr>
-    </w:p>
-    <w:p>
-      <w:pPr>
-        <w:rPr>
-          <w:rFonts w:hint="eastAsia"/>
-          <w:b/>
-          <w:bCs/>
-        </w:rPr>
-      </w:pPr>
-      <w:r>
-        <w:rPr>
-          <w:rFonts w:hint="eastAsia"/>
-          <w:b/>
-          <w:bCs/>
-        </w:rPr>
-        <w:lastRenderedPageBreak/>
-        <w:t>Gen. Prediction Depth</w:t>
-      </w:r>
-    </w:p>
-    <w:p>
-      <w:pPr>
-        <w:rPr>
-          <w:rFonts w:hint="eastAsia"/>
-        </w:rPr>
-      </w:pPr>
-      <w:r>
-        <w:rPr>
-          <w:noProof/>
-        </w:rPr>
-        <w:drawing>
-          <wp:inline distT="0" distB="0" distL="0" distR="0" wp14:anchorId="290A26DB" wp14:editId="7DE54B2F">
-            <wp:extent cx="3282462" cy="2059344"/>
-            <wp:effectExtent l="0" t="0" r="0" b="0"/>
-            <wp:docPr id="868317609" name="图片 1"/>
-            <wp:cNvGraphicFramePr>
-              <a:graphicFrameLocks xmlns:a="http://schemas.openxmlformats.org/drawingml/2006/main" noChangeAspect="1"/>
-            </wp:cNvGraphicFramePr>
-            <a:graphic xmlns:a="http://schemas.openxmlformats.org/drawingml/2006/main">
-              <a:graphicData uri="http://schemas.openxmlformats.org/drawingml/2006/picture">
-                <pic:pic xmlns:pic="http://schemas.openxmlformats.org/drawingml/2006/picture">
-                  <pic:nvPicPr>
-                    <pic:cNvPr id="868317609" name=""/>
-                    <pic:cNvPicPr/>
-                  </pic:nvPicPr>
-                  <pic:blipFill>
-                    <a:blip r:embed="rId14"/>
-                    <a:stretch>
-                      <a:fillRect/>
-                    </a:stretch>
-                  </pic:blipFill>
-                  <pic:spPr>
-                    <a:xfrm>
-                      <a:off x="0" y="0"/>
-                      <a:ext cx="3293808" cy="2066462"/>
-                    </a:xfrm>
-                    <a:prstGeom prst="rect">
-                      <a:avLst/>
-                    </a:prstGeom>
-                  </pic:spPr>
-                </pic:pic>
-              </a:graphicData>
-            </a:graphic>
-          </wp:inline>
-        </w:drawing>
-      </w:r>
-    </w:p>
-    <w:p>
-      <w:pPr>
-        <w:rPr>
-          <w:rFonts w:hint="eastAsia"/>
-        </w:rPr>
-      </w:pPr>
-      <w:r>
-        <w:rPr>
-          <w:rFonts w:hint="eastAsia"/>
-        </w:rPr>
-        <w:t>该功能为机器学习生成预测点水深的主要模块，通过设置工作空间路径，自动读取</w:t>
-      </w:r>
-      <w:proofErr w:type="spellStart"/>
-      <w:r>
-        <w:rPr>
-          <w:rFonts w:hint="eastAsia"/>
-        </w:rPr>
-        <w:t>MLData</w:t>
-      </w:r>
-      <w:proofErr w:type="spellEnd"/>
-      <w:r>
-        <w:rPr>
-          <w:rFonts w:hint="eastAsia"/>
-        </w:rPr>
-        <w:t>中前置文件与其余相关文件，设置全湖平均分布的预测点相关参数，在多轮优化后得到最优结果，输出</w:t>
-      </w:r>
-      <w:proofErr w:type="spellStart"/>
-      <w:r>
-        <w:rPr>
-          <w:rFonts w:hint="eastAsia"/>
-        </w:rPr>
-        <w:t>temp_ML</w:t>
-      </w:r>
-      <w:proofErr w:type="spellEnd"/>
-      <w:r>
-        <w:rPr>
-          <w:rFonts w:hint="eastAsia"/>
-        </w:rPr>
-        <w:t>中的预测点</w:t>
+        <w:t>、湖岸线</w:t>
       </w:r>
       <w:proofErr w:type="spellStart"/>
       <w:r>
@@ -1507,143 +1410,11 @@
         <w:t>shp</w:t>
       </w:r>
       <w:proofErr w:type="spellEnd"/>
-    </w:p>
-    <w:p>
-      <w:pPr>
-        <w:rPr>
-          <w:rFonts w:hint="eastAsia"/>
-          <w:color w:val="EE0000"/>
-        </w:rPr>
-      </w:pPr>
-      <w:r>
-        <w:rPr>
-          <w:color w:val="EE0000"/>
-        </w:rPr>
-        <w:t>目前并未添加可视化加载进度条，因此在机器学习预测深度部分可能会遇到点击确定后长时间无反应情况，请不要点击软件界面导致未知的卡死，只要没出现未响应软件就依旧在正常运行，请耐心等待至出现task completed弹窗</w:t>
-      </w:r>
-    </w:p>
-    <w:p>
-      <w:pPr>
-        <w:rPr>
-          <w:rFonts w:hint="eastAsia"/>
-        </w:rPr>
-      </w:pPr>
-      <w:r>
-        <w:t xml:space="preserve">This function serves as the main module for machine learning to generate predicted water depth points. By setting the workspace path, it automatically reads the pre-processing files and other related files in </w:t>
-      </w:r>
-      <w:proofErr w:type="spellStart"/>
-      <w:r>
-        <w:t>MLData</w:t>
-      </w:r>
-      <w:proofErr w:type="spellEnd"/>
-      <w:r>
-        <w:t xml:space="preserve">, configures parameters for lake-wide uniformly distributed prediction points, and obtains the optimal results after multiple rounds of optimization, outputting the predicted point SHP files in </w:t>
-      </w:r>
-      <w:proofErr w:type="spellStart"/>
-      <w:r>
-        <w:t>temp_ML</w:t>
-      </w:r>
-      <w:proofErr w:type="spellEnd"/>
-      <w:r>
-        <w:t>.</w:t>
-      </w:r>
-    </w:p>
-    <w:p>
-      <w:pPr>
-        <w:rPr>
-          <w:rFonts w:hint="eastAsia"/>
-          <w:color w:val="EE0000"/>
-        </w:rPr>
-      </w:pPr>
-      <w:r>
-        <w:rPr>
-          <w:color w:val="EE0000"/>
-        </w:rPr>
-        <w:t>Currently, there is no visual loading progress bar implemented. Therefore, during the machine learning prediction phase, you may experience a prolonged unresponsive state after clicking "OK." Please refrain from interacting with the software interface to avoid potential freezes. As long as the software does not display a "Not Responding" message, it is still operating normally. Kindly wait patiently until the "Task Completed" pop-up window appears.</w:t>
-      </w:r>
-    </w:p>
-    <w:p>
-      <w:pPr>
-        <w:rPr>
-          <w:rFonts w:hint="eastAsia"/>
-        </w:rPr>
-      </w:pPr>
-    </w:p>
-    <w:p>
-      <w:pPr>
-        <w:rPr>
-          <w:rFonts w:hint="eastAsia"/>
-          <w:b/>
-          <w:bCs/>
-        </w:rPr>
-      </w:pPr>
-      <w:r>
-        <w:rPr>
-          <w:rFonts w:hint="eastAsia"/>
-          <w:b/>
-          <w:bCs/>
-        </w:rPr>
-        <w:t>Terrain generation</w:t>
-      </w:r>
-    </w:p>
-    <w:p>
-      <w:pPr>
-        <w:rPr>
-          <w:rFonts w:hint="eastAsia"/>
-        </w:rPr>
-      </w:pPr>
-      <w:r>
-        <w:rPr>
-          <w:noProof/>
-        </w:rPr>
-        <w:drawing>
-          <wp:inline distT="0" distB="0" distL="0" distR="0" wp14:anchorId="542A5EC8" wp14:editId="200F1E57">
-            <wp:extent cx="3171092" cy="2366293"/>
-            <wp:effectExtent l="0" t="0" r="0" b="0"/>
-            <wp:docPr id="532888126" name="图片 1"/>
-            <wp:cNvGraphicFramePr>
-              <a:graphicFrameLocks xmlns:a="http://schemas.openxmlformats.org/drawingml/2006/main" noChangeAspect="1"/>
-            </wp:cNvGraphicFramePr>
-            <a:graphic xmlns:a="http://schemas.openxmlformats.org/drawingml/2006/main">
-              <a:graphicData uri="http://schemas.openxmlformats.org/drawingml/2006/picture">
-                <pic:pic xmlns:pic="http://schemas.openxmlformats.org/drawingml/2006/picture">
-                  <pic:nvPicPr>
-                    <pic:cNvPr id="532888126" name=""/>
-                    <pic:cNvPicPr/>
-                  </pic:nvPicPr>
-                  <pic:blipFill>
-                    <a:blip r:embed="rId15"/>
-                    <a:stretch>
-                      <a:fillRect/>
-                    </a:stretch>
-                  </pic:blipFill>
-                  <pic:spPr>
-                    <a:xfrm>
-                      <a:off x="0" y="0"/>
-                      <a:ext cx="3188261" cy="2379105"/>
-                    </a:xfrm>
-                    <a:prstGeom prst="rect">
-                      <a:avLst/>
-                    </a:prstGeom>
-                  </pic:spPr>
-                </pic:pic>
-              </a:graphicData>
-            </a:graphic>
-          </wp:inline>
-        </w:drawing>
-      </w:r>
-    </w:p>
-    <w:p>
-      <w:pPr>
-        <w:rPr>
-          <w:rFonts w:hint="eastAsia"/>
-        </w:rPr>
-      </w:pPr>
-      <w:r>
-        <w:rPr>
-          <w:rFonts w:hint="eastAsia"/>
-        </w:rPr>
-        <w:t>该功能通过利用生成的预测点</w:t>
+      <w:r>
+        <w:rPr>
+          <w:rFonts w:hint="eastAsia"/>
+        </w:rPr>
+        <w:t>、湖泊面</w:t>
       </w:r>
       <w:proofErr w:type="spellStart"/>
       <w:r>
@@ -1657,34 +1428,6 @@
         <w:rPr>
           <w:rFonts w:hint="eastAsia"/>
         </w:rPr>
-        <w:t>、湖岸线</w:t>
-      </w:r>
-      <w:proofErr w:type="spellStart"/>
-      <w:r>
-        <w:rPr>
-          <w:rFonts w:hint="eastAsia"/>
-        </w:rPr>
-        <w:t>shp</w:t>
-      </w:r>
-      <w:proofErr w:type="spellEnd"/>
-      <w:r>
-        <w:rPr>
-          <w:rFonts w:hint="eastAsia"/>
-        </w:rPr>
-        <w:t>、湖泊面</w:t>
-      </w:r>
-      <w:proofErr w:type="spellStart"/>
-      <w:r>
-        <w:rPr>
-          <w:rFonts w:hint="eastAsia"/>
-        </w:rPr>
-        <w:t>shp</w:t>
-      </w:r>
-      <w:proofErr w:type="spellEnd"/>
-      <w:r>
-        <w:rPr>
-          <w:rFonts w:hint="eastAsia"/>
-        </w:rPr>
         <w:t>，通过自定义的分辨率实现从点到面的水深预测，输出得到水深分布的</w:t>
       </w:r>
       <w:proofErr w:type="spellStart"/>
@@ -1709,7 +1452,6 @@
         </w:rPr>
       </w:pPr>
       <w:r>
-        <w:lastRenderedPageBreak/>
         <w:t>This feature utilizes generated prediction point SHP files, shoreline SHP files, and lake surface SHP files to achieve depth prediction from points to surfaces with a user-defined resolution, outputting a TIF file of the water depth distribution.</w:t>
       </w:r>
     </w:p>
@@ -1763,7 +1505,7 @@
                     <pic:cNvPicPr/>
                   </pic:nvPicPr>
                   <pic:blipFill>
-                    <a:blip r:embed="rId16"/>
+                    <a:blip r:embed="rId14"/>
                     <a:stretch>
                       <a:fillRect/>
                     </a:stretch>
@@ -1927,7 +1669,7 @@
                     <pic:cNvPicPr/>
                   </pic:nvPicPr>
                   <pic:blipFill>
-                    <a:blip r:embed="rId17"/>
+                    <a:blip r:embed="rId15"/>
                     <a:stretch>
                       <a:fillRect/>
                     </a:stretch>
@@ -2049,29 +1791,6 @@
         <w:tabs>
           <w:tab w:val="left" w:pos="615"/>
         </w:tabs>
-        <w:rPr>
-          <w:rFonts w:hint="eastAsia"/>
-        </w:rPr>
-      </w:pPr>
-    </w:p>
-    <w:p>
-      <w:pPr>
-        <w:tabs>
-          <w:tab w:val="left" w:pos="615"/>
-        </w:tabs>
-        <w:rPr>
-          <w:rFonts w:hint="eastAsia"/>
-        </w:rPr>
-      </w:pPr>
-    </w:p>
-    <w:p>
-      <w:pPr>
-        <w:tabs>
-          <w:tab w:val="left" w:pos="615"/>
-        </w:tabs>
-        <w:rPr>
-          <w:rFonts w:hint="eastAsia"/>
-        </w:rPr>
       </w:pPr>
     </w:p>
     <w:p>
@@ -2142,7 +1861,7 @@
                     <pic:cNvPicPr/>
                   </pic:nvPicPr>
                   <pic:blipFill>
-                    <a:blip r:embed="rId18"/>
+                    <a:blip r:embed="rId16"/>
                     <a:stretch>
                       <a:fillRect/>
                     </a:stretch>
@@ -2306,7 +2025,7 @@
                     <pic:cNvPicPr/>
                   </pic:nvPicPr>
                   <pic:blipFill>
-                    <a:blip r:embed="rId19"/>
+                    <a:blip r:embed="rId17"/>
                     <a:stretch>
                       <a:fillRect/>
                     </a:stretch>
@@ -2497,7 +2216,7 @@
                     <pic:cNvPicPr/>
                   </pic:nvPicPr>
                   <pic:blipFill>
-                    <a:blip r:embed="rId20"/>
+                    <a:blip r:embed="rId18"/>
                     <a:stretch>
                       <a:fillRect/>
                     </a:stretch>
@@ -2603,7 +2322,7 @@
                     <pic:cNvPicPr/>
                   </pic:nvPicPr>
                   <pic:blipFill>
-                    <a:blip r:embed="rId21"/>
+                    <a:blip r:embed="rId19"/>
                     <a:stretch>
                       <a:fillRect/>
                     </a:stretch>
@@ -2634,7 +2353,13 @@
         <w:rPr>
           <w:rFonts w:hint="eastAsia"/>
         </w:rPr>
-        <w:t>该功能通过设置实测点</w:t>
+        <w:t>该功能通过设置实测</w:t>
+      </w:r>
+      <w:r>
+        <w:rPr>
+          <w:rFonts w:hint="eastAsia"/>
+        </w:rPr>
+        <w:t>测线</w:t>
       </w:r>
       <w:proofErr w:type="spellStart"/>
       <w:r>
@@ -2696,7 +2421,16 @@
         </w:rPr>
       </w:pPr>
       <w:r>
-        <w:t xml:space="preserve">This function verifies the accuracy distribution of predictions along measured lines by setting the measured point SHP, the predicted lake basin </w:t>
+        <w:t xml:space="preserve">This function verifies the accuracy distribution of predictions along measured lines by setting the measured </w:t>
+      </w:r>
+      <w:r>
+        <w:rPr>
+          <w:rFonts w:hint="eastAsia"/>
+        </w:rPr>
+        <w:t>survey line</w:t>
+      </w:r>
+      <w:r>
+        <w:t xml:space="preserve"> SHP, the predicted lake basin </w:t>
       </w:r>
       <w:r>
         <w:t>DEM</w:t>
@@ -2736,7 +2470,7 @@
 </file>
 
 <file path=word/endnotes.xml><?xml version="1.0" encoding="utf-8"?>
-<w:endnotes xmlns:wpc="http://schemas.microsoft.com/office/word/2010/wordprocessingCanvas" xmlns:cx="http://schemas.microsoft.com/office/drawing/2014/chartex" xmlns:cx1="http://schemas.microsoft.com/office/drawing/2015/9/8/chartex" xmlns:cx2="http://schemas.microsoft.com/office/drawing/2015/10/21/chartex" xmlns:cx3="http://schemas.microsoft.com/office/drawing/2016/5/9/chartex" xmlns:cx4="http://schemas.microsoft.com/office/drawing/2016/5/10/chartex" xmlns:cx5="http://schemas.microsoft.com/office/drawing/2016/5/11/chartex" xmlns:cx6="http://schemas.microsoft.com/office/drawing/2016/5/12/chartex" xmlns:cx7="http://schemas.microsoft.com/office/drawing/2016/5/13/chartex" xmlns:cx8="http://schemas.microsoft.com/office/drawing/2016/5/14/chartex" xmlns:mc="http://schemas.openxmlformats.org/markup-compatibility/2006" xmlns:aink="http://schemas.microsoft.com/office/drawing/2016/ink" xmlns:am3d="http://schemas.microsoft.com/office/drawing/2017/model3d" xmlns:o="urn:schemas-microsoft-com:office:office" xmlns:oel="http://schemas.microsoft.com/office/2019/extlst" xmlns:r="http://schemas.openxmlformats.org/officeDocument/2006/relationships" xmlns:m="http://schemas.openxmlformats.org/officeDocument/2006/math" xmlns:v="urn:schemas-microsoft-com:vml" xmlns:wp14="http://schemas.microsoft.com/office/word/2010/wordprocessingDrawing" xmlns:wp="http://schemas.openxmlformats.org/drawingml/2006/wordprocessingDrawing" xmlns:w10="urn:schemas-microsoft-com:office:word" xmlns:w="http://schemas.openxmlformats.org/wordprocessingml/2006/main" xmlns:w14="http://schemas.microsoft.com/office/word/2010/wordml" xmlns:w15="http://schemas.microsoft.com/office/word/2012/wordml" xmlns:w16cei="http://schemas.microsoft.com/office/word/2026/wordml/cei" xmlns:w16cex="http://schemas.microsoft.com/office/word/2018/wordml/cex" xmlns:w16cid="http://schemas.microsoft.com/office/word/2016/wordml/cid" xmlns:w16="http://schemas.microsoft.com/office/word/2018/wordml" xmlns:w16du="http://schemas.microsoft.com/office/word/2023/wordml/word16du" xmlns:w16sdtdh="http://schemas.microsoft.com/office/word/2020/wordml/sdtdatahash" xmlns:w16sdtfl="http://schemas.microsoft.com/office/word/2024/wordml/sdtformatlock" xmlns:w16se="http://schemas.microsoft.com/office/word/2015/wordml/symex" xmlns:wpg="http://schemas.microsoft.com/office/word/2010/wordprocessingGroup" xmlns:wpi="http://schemas.microsoft.com/office/word/2010/wordprocessingInk" xmlns:wne="http://schemas.microsoft.com/office/word/2006/wordml" xmlns:wps="http://schemas.microsoft.com/office/word/2010/wordprocessingShape" mc:Ignorable="w14 w15 w16se w16cid w16 w16cex w16sdtdh w16sdtfl w16du wp14">
+<w:endnotes xmlns:wpc="http://schemas.microsoft.com/office/word/2010/wordprocessingCanvas" xmlns:cx="http://schemas.microsoft.com/office/drawing/2014/chartex" xmlns:cx1="http://schemas.microsoft.com/office/drawing/2015/9/8/chartex" xmlns:cx2="http://schemas.microsoft.com/office/drawing/2015/10/21/chartex" xmlns:cx3="http://schemas.microsoft.com/office/drawing/2016/5/9/chartex" xmlns:cx4="http://schemas.microsoft.com/office/drawing/2016/5/10/chartex" xmlns:cx5="http://schemas.microsoft.com/office/drawing/2016/5/11/chartex" xmlns:cx6="http://schemas.microsoft.com/office/drawing/2016/5/12/chartex" xmlns:cx7="http://schemas.microsoft.com/office/drawing/2016/5/13/chartex" xmlns:cx8="http://schemas.microsoft.com/office/drawing/2016/5/14/chartex" xmlns:mc="http://schemas.openxmlformats.org/markup-compatibility/2006" xmlns:aink="http://schemas.microsoft.com/office/drawing/2016/ink" xmlns:am3d="http://schemas.microsoft.com/office/drawing/2017/model3d" xmlns:o="urn:schemas-microsoft-com:office:office" xmlns:oel="http://schemas.microsoft.com/office/2019/extlst" xmlns:r="http://schemas.openxmlformats.org/officeDocument/2006/relationships" xmlns:m="http://schemas.openxmlformats.org/officeDocument/2006/math" xmlns:v="urn:schemas-microsoft-com:vml" xmlns:wp14="http://schemas.microsoft.com/office/word/2010/wordprocessingDrawing" xmlns:wp="http://schemas.openxmlformats.org/drawingml/2006/wordprocessingDrawing" xmlns:w10="urn:schemas-microsoft-com:office:word" xmlns:w="http://schemas.openxmlformats.org/wordprocessingml/2006/main" xmlns:w14="http://schemas.microsoft.com/office/word/2010/wordml" xmlns:w15="http://schemas.microsoft.com/office/word/2012/wordml" xmlns:w16cex="http://schemas.microsoft.com/office/word/2018/wordml/cex" xmlns:w16cid="http://schemas.microsoft.com/office/word/2016/wordml/cid" xmlns:w16="http://schemas.microsoft.com/office/word/2018/wordml" xmlns:w16du="http://schemas.microsoft.com/office/word/2023/wordml/word16du" xmlns:w16sdtdh="http://schemas.microsoft.com/office/word/2020/wordml/sdtdatahash" xmlns:w16sdtfl="http://schemas.microsoft.com/office/word/2024/wordml/sdtformatlock" xmlns:w16se="http://schemas.microsoft.com/office/word/2015/wordml/symex" xmlns:wpg="http://schemas.microsoft.com/office/word/2010/wordprocessingGroup" xmlns:wpi="http://schemas.microsoft.com/office/word/2010/wordprocessingInk" xmlns:wne="http://schemas.microsoft.com/office/word/2006/wordml" xmlns:wps="http://schemas.microsoft.com/office/word/2010/wordprocessingShape" mc:Ignorable="w14 w15 w16se w16cid w16 w16cex w16sdtdh w16sdtfl w16du wp14">
   <w:endnote w:type="separator" w:id="-1">
     <w:p>
       <w:pPr>
@@ -2765,7 +2499,7 @@
 </file>
 
 <file path=word/footnotes.xml><?xml version="1.0" encoding="utf-8"?>
-<w:footnotes xmlns:wpc="http://schemas.microsoft.com/office/word/2010/wordprocessingCanvas" xmlns:cx="http://schemas.microsoft.com/office/drawing/2014/chartex" xmlns:cx1="http://schemas.microsoft.com/office/drawing/2015/9/8/chartex" xmlns:cx2="http://schemas.microsoft.com/office/drawing/2015/10/21/chartex" xmlns:cx3="http://schemas.microsoft.com/office/drawing/2016/5/9/chartex" xmlns:cx4="http://schemas.microsoft.com/office/drawing/2016/5/10/chartex" xmlns:cx5="http://schemas.microsoft.com/office/drawing/2016/5/11/chartex" xmlns:cx6="http://schemas.microsoft.com/office/drawing/2016/5/12/chartex" xmlns:cx7="http://schemas.microsoft.com/office/drawing/2016/5/13/chartex" xmlns:cx8="http://schemas.microsoft.com/office/drawing/2016/5/14/chartex" xmlns:mc="http://schemas.openxmlformats.org/markup-compatibility/2006" xmlns:aink="http://schemas.microsoft.com/office/drawing/2016/ink" xmlns:am3d="http://schemas.microsoft.com/office/drawing/2017/model3d" xmlns:o="urn:schemas-microsoft-com:office:office" xmlns:oel="http://schemas.microsoft.com/office/2019/extlst" xmlns:r="http://schemas.openxmlformats.org/officeDocument/2006/relationships" xmlns:m="http://schemas.openxmlformats.org/officeDocument/2006/math" xmlns:v="urn:schemas-microsoft-com:vml" xmlns:wp14="http://schemas.microsoft.com/office/word/2010/wordprocessingDrawing" xmlns:wp="http://schemas.openxmlformats.org/drawingml/2006/wordprocessingDrawing" xmlns:w10="urn:schemas-microsoft-com:office:word" xmlns:w="http://schemas.openxmlformats.org/wordprocessingml/2006/main" xmlns:w14="http://schemas.microsoft.com/office/word/2010/wordml" xmlns:w15="http://schemas.microsoft.com/office/word/2012/wordml" xmlns:w16cei="http://schemas.microsoft.com/office/word/2026/wordml/cei" xmlns:w16cex="http://schemas.microsoft.com/office/word/2018/wordml/cex" xmlns:w16cid="http://schemas.microsoft.com/office/word/2016/wordml/cid" xmlns:w16="http://schemas.microsoft.com/office/word/2018/wordml" xmlns:w16du="http://schemas.microsoft.com/office/word/2023/wordml/word16du" xmlns:w16sdtdh="http://schemas.microsoft.com/office/word/2020/wordml/sdtdatahash" xmlns:w16sdtfl="http://schemas.microsoft.com/office/word/2024/wordml/sdtformatlock" xmlns:w16se="http://schemas.microsoft.com/office/word/2015/wordml/symex" xmlns:wpg="http://schemas.microsoft.com/office/word/2010/wordprocessingGroup" xmlns:wpi="http://schemas.microsoft.com/office/word/2010/wordprocessingInk" xmlns:wne="http://schemas.microsoft.com/office/word/2006/wordml" xmlns:wps="http://schemas.microsoft.com/office/word/2010/wordprocessingShape" mc:Ignorable="w14 w15 w16se w16cid w16 w16cex w16sdtdh w16sdtfl w16du wp14">
+<w:footnotes xmlns:wpc="http://schemas.microsoft.com/office/word/2010/wordprocessingCanvas" xmlns:cx="http://schemas.microsoft.com/office/drawing/2014/chartex" xmlns:cx1="http://schemas.microsoft.com/office/drawing/2015/9/8/chartex" xmlns:cx2="http://schemas.microsoft.com/office/drawing/2015/10/21/chartex" xmlns:cx3="http://schemas.microsoft.com/office/drawing/2016/5/9/chartex" xmlns:cx4="http://schemas.microsoft.com/office/drawing/2016/5/10/chartex" xmlns:cx5="http://schemas.microsoft.com/office/drawing/2016/5/11/chartex" xmlns:cx6="http://schemas.microsoft.com/office/drawing/2016/5/12/chartex" xmlns:cx7="http://schemas.microsoft.com/office/drawing/2016/5/13/chartex" xmlns:cx8="http://schemas.microsoft.com/office/drawing/2016/5/14/chartex" xmlns:mc="http://schemas.openxmlformats.org/markup-compatibility/2006" xmlns:aink="http://schemas.microsoft.com/office/drawing/2016/ink" xmlns:am3d="http://schemas.microsoft.com/office/drawing/2017/model3d" xmlns:o="urn:schemas-microsoft-com:office:office" xmlns:oel="http://schemas.microsoft.com/office/2019/extlst" xmlns:r="http://schemas.openxmlformats.org/officeDocument/2006/relationships" xmlns:m="http://schemas.openxmlformats.org/officeDocument/2006/math" xmlns:v="urn:schemas-microsoft-com:vml" xmlns:wp14="http://schemas.microsoft.com/office/word/2010/wordprocessingDrawing" xmlns:wp="http://schemas.openxmlformats.org/drawingml/2006/wordprocessingDrawing" xmlns:w10="urn:schemas-microsoft-com:office:word" xmlns:w="http://schemas.openxmlformats.org/wordprocessingml/2006/main" xmlns:w14="http://schemas.microsoft.com/office/word/2010/wordml" xmlns:w15="http://schemas.microsoft.com/office/word/2012/wordml" xmlns:w16cex="http://schemas.microsoft.com/office/word/2018/wordml/cex" xmlns:w16cid="http://schemas.microsoft.com/office/word/2016/wordml/cid" xmlns:w16="http://schemas.microsoft.com/office/word/2018/wordml" xmlns:w16du="http://schemas.microsoft.com/office/word/2023/wordml/word16du" xmlns:w16sdtdh="http://schemas.microsoft.com/office/word/2020/wordml/sdtdatahash" xmlns:w16sdtfl="http://schemas.microsoft.com/office/word/2024/wordml/sdtformatlock" xmlns:w16se="http://schemas.microsoft.com/office/word/2015/wordml/symex" xmlns:wpg="http://schemas.microsoft.com/office/word/2010/wordprocessingGroup" xmlns:wpi="http://schemas.microsoft.com/office/word/2010/wordprocessingInk" xmlns:wne="http://schemas.microsoft.com/office/word/2006/wordml" xmlns:wps="http://schemas.microsoft.com/office/word/2010/wordprocessingShape" mc:Ignorable="w14 w15 w16se w16cid w16 w16cex w16sdtdh w16sdtfl w16du wp14">
   <w:footnote w:type="separator" w:id="-1">
     <w:p>
       <w:pPr>
@@ -2794,7 +2528,7 @@
 </file>
 
 <file path=word/numbering.xml><?xml version="1.0" encoding="utf-8"?>
-<w:numbering xmlns:wpc="http://schemas.microsoft.com/office/word/2010/wordprocessingCanvas" xmlns:cx="http://schemas.microsoft.com/office/drawing/2014/chartex" xmlns:cx1="http://schemas.microsoft.com/office/drawing/2015/9/8/chartex" xmlns:cx2="http://schemas.microsoft.com/office/drawing/2015/10/21/chartex" xmlns:cx3="http://schemas.microsoft.com/office/drawing/2016/5/9/chartex" xmlns:cx4="http://schemas.microsoft.com/office/drawing/2016/5/10/chartex" xmlns:cx5="http://schemas.microsoft.com/office/drawing/2016/5/11/chartex" xmlns:cx6="http://schemas.microsoft.com/office/drawing/2016/5/12/chartex" xmlns:cx7="http://schemas.microsoft.com/office/drawing/2016/5/13/chartex" xmlns:cx8="http://schemas.microsoft.com/office/drawing/2016/5/14/chartex" xmlns:mc="http://schemas.openxmlformats.org/markup-compatibility/2006" xmlns:aink="http://schemas.microsoft.com/office/drawing/2016/ink" xmlns:am3d="http://schemas.microsoft.com/office/drawing/2017/model3d" xmlns:o="urn:schemas-microsoft-com:office:office" xmlns:oel="http://schemas.microsoft.com/office/2019/extlst" xmlns:r="http://schemas.openxmlformats.org/officeDocument/2006/relationships" xmlns:m="http://schemas.openxmlformats.org/officeDocument/2006/math" xmlns:v="urn:schemas-microsoft-com:vml" xmlns:wp14="http://schemas.microsoft.com/office/word/2010/wordprocessingDrawing" xmlns:wp="http://schemas.openxmlformats.org/drawingml/2006/wordprocessingDrawing" xmlns:w10="urn:schemas-microsoft-com:office:word" xmlns:w="http://schemas.openxmlformats.org/wordprocessingml/2006/main" xmlns:w14="http://schemas.microsoft.com/office/word/2010/wordml" xmlns:w15="http://schemas.microsoft.com/office/word/2012/wordml" xmlns:w16cei="http://schemas.microsoft.com/office/word/2026/wordml/cei" xmlns:w16cex="http://schemas.microsoft.com/office/word/2018/wordml/cex" xmlns:w16cid="http://schemas.microsoft.com/office/word/2016/wordml/cid" xmlns:w16="http://schemas.microsoft.com/office/word/2018/wordml" xmlns:w16du="http://schemas.microsoft.com/office/word/2023/wordml/word16du" xmlns:w16sdtdh="http://schemas.microsoft.com/office/word/2020/wordml/sdtdatahash" xmlns:w16sdtfl="http://schemas.microsoft.com/office/word/2024/wordml/sdtformatlock" xmlns:w16se="http://schemas.microsoft.com/office/word/2015/wordml/symex" xmlns:wpg="http://schemas.microsoft.com/office/word/2010/wordprocessingGroup" xmlns:wpi="http://schemas.microsoft.com/office/word/2010/wordprocessingInk" xmlns:wne="http://schemas.microsoft.com/office/word/2006/wordml" xmlns:wps="http://schemas.microsoft.com/office/word/2010/wordprocessingShape" mc:Ignorable="w14 w15 w16se w16cid w16 w16cex w16sdtdh w16sdtfl w16du wp14">
+<w:numbering xmlns:wpc="http://schemas.microsoft.com/office/word/2010/wordprocessingCanvas" xmlns:cx="http://schemas.microsoft.com/office/drawing/2014/chartex" xmlns:cx1="http://schemas.microsoft.com/office/drawing/2015/9/8/chartex" xmlns:cx2="http://schemas.microsoft.com/office/drawing/2015/10/21/chartex" xmlns:cx3="http://schemas.microsoft.com/office/drawing/2016/5/9/chartex" xmlns:cx4="http://schemas.microsoft.com/office/drawing/2016/5/10/chartex" xmlns:cx5="http://schemas.microsoft.com/office/drawing/2016/5/11/chartex" xmlns:cx6="http://schemas.microsoft.com/office/drawing/2016/5/12/chartex" xmlns:cx7="http://schemas.microsoft.com/office/drawing/2016/5/13/chartex" xmlns:cx8="http://schemas.microsoft.com/office/drawing/2016/5/14/chartex" xmlns:mc="http://schemas.openxmlformats.org/markup-compatibility/2006" xmlns:aink="http://schemas.microsoft.com/office/drawing/2016/ink" xmlns:am3d="http://schemas.microsoft.com/office/drawing/2017/model3d" xmlns:o="urn:schemas-microsoft-com:office:office" xmlns:oel="http://schemas.microsoft.com/office/2019/extlst" xmlns:r="http://schemas.openxmlformats.org/officeDocument/2006/relationships" xmlns:m="http://schemas.openxmlformats.org/officeDocument/2006/math" xmlns:v="urn:schemas-microsoft-com:vml" xmlns:wp14="http://schemas.microsoft.com/office/word/2010/wordprocessingDrawing" xmlns:wp="http://schemas.openxmlformats.org/drawingml/2006/wordprocessingDrawing" xmlns:w10="urn:schemas-microsoft-com:office:word" xmlns:w="http://schemas.openxmlformats.org/wordprocessingml/2006/main" xmlns:w14="http://schemas.microsoft.com/office/word/2010/wordml" xmlns:w15="http://schemas.microsoft.com/office/word/2012/wordml" xmlns:w16cex="http://schemas.microsoft.com/office/word/2018/wordml/cex" xmlns:w16cid="http://schemas.microsoft.com/office/word/2016/wordml/cid" xmlns:w16="http://schemas.microsoft.com/office/word/2018/wordml" xmlns:w16du="http://schemas.microsoft.com/office/word/2023/wordml/word16du" xmlns:w16sdtdh="http://schemas.microsoft.com/office/word/2020/wordml/sdtdatahash" xmlns:w16sdtfl="http://schemas.microsoft.com/office/word/2024/wordml/sdtformatlock" xmlns:w16se="http://schemas.microsoft.com/office/word/2015/wordml/symex" xmlns:wpg="http://schemas.microsoft.com/office/word/2010/wordprocessingGroup" xmlns:wpi="http://schemas.microsoft.com/office/word/2010/wordprocessingInk" xmlns:wne="http://schemas.microsoft.com/office/word/2006/wordml" xmlns:wps="http://schemas.microsoft.com/office/word/2010/wordprocessingShape" mc:Ignorable="w14 w15 w16se w16cid w16 w16cex w16sdtdh w16sdtfl w16du wp14">
   <w:abstractNum w:abstractNumId="0" w15:restartNumberingAfterBreak="0">
     <w:nsid w:val="34A553D0"/>
     <w:multiLevelType w:val="hybridMultilevel"/>

</xml_diff>